<commit_message>
fix: replace literal Name/Date text with {{NAME}}/{{DATE}} placeholders in certificate template
Agent-Logs-Url: https://github.com/Poornamadhushan/Github-Copilot-CLI-Demo/sessions/e7a50d7c-c935-46ee-bba6-db5a11cb2333

Co-authored-by: Poornamadhushan <148749861+Poornamadhushan@users.noreply.github.com>
</commit_message>
<xml_diff>
--- a/templates/certificate-template.docx
+++ b/templates/certificate-template.docx
@@ -80,15 +80,7 @@
                                     <w:sz w:val="72"/>
                                     <w:szCs w:val="260"/>
                                   </w:rPr>
-                                  <w:t>N</w:t>
-                                </w:r>
-                                <w:r>
-                                  <w:rPr>
-                                    <w:rFonts w:ascii="Segoe Pro" w:hAnsi="Segoe Pro"/>
-                                    <w:sz w:val="72"/>
-                                    <w:szCs w:val="260"/>
-                                  </w:rPr>
-                                  <w:t>ame</w:t>
+                                  <w:t>{{NAME}}</w:t>
                                 </w:r>
                               </w:sdtContent>
                             </w:sdt>
@@ -147,15 +139,7 @@
                               <w:sz w:val="72"/>
                               <w:szCs w:val="260"/>
                             </w:rPr>
-                            <w:t>N</w:t>
-                          </w:r>
-                          <w:r>
-                            <w:rPr>
-                              <w:rFonts w:ascii="Segoe Pro" w:hAnsi="Segoe Pro"/>
-                              <w:sz w:val="72"/>
-                              <w:szCs w:val="260"/>
-                            </w:rPr>
-                            <w:t>ame</w:t>
+                            <w:t>{{NAME}}</w:t>
                           </w:r>
                         </w:sdtContent>
                       </w:sdt>
@@ -303,15 +287,7 @@
                                     <w:sz w:val="42"/>
                                     <w:szCs w:val="32"/>
                                   </w:rPr>
-                                  <w:t>Dat</w:t>
-                                </w:r>
-                                <w:r>
-                                  <w:rPr>
-                                    <w:rFonts w:ascii="Segoe Pro" w:hAnsi="Segoe Pro"/>
-                                    <w:sz w:val="42"/>
-                                    <w:szCs w:val="32"/>
-                                  </w:rPr>
-                                  <w:t>e</w:t>
+                                  <w:t>{{DATE}}</w:t>
                                 </w:r>
                               </w:sdtContent>
                             </w:sdt>
@@ -364,15 +340,7 @@
                               <w:sz w:val="42"/>
                               <w:szCs w:val="32"/>
                             </w:rPr>
-                            <w:t>Dat</w:t>
-                          </w:r>
-                          <w:r>
-                            <w:rPr>
-                              <w:rFonts w:ascii="Segoe Pro" w:hAnsi="Segoe Pro"/>
-                              <w:sz w:val="42"/>
-                              <w:szCs w:val="32"/>
-                            </w:rPr>
-                            <w:t>e</w:t>
+                            <w:t>{{DATE}}</w:t>
                           </w:r>
                         </w:sdtContent>
                       </w:sdt>

</xml_diff>

<commit_message>
feat: update certificate template to use dynamic placeholders for name and date
</commit_message>
<xml_diff>
--- a/templates/certificate-template.docx
+++ b/templates/certificate-template.docx
@@ -13,238 +13,13 @@
         <mc:AlternateContent>
           <mc:Choice Requires="wps">
             <w:drawing>
-              <wp:anchor distT="45720" distB="45720" distL="114300" distR="114300" simplePos="0" relativeHeight="251658240" behindDoc="0" locked="0" layoutInCell="1" allowOverlap="1" wp14:anchorId="2AE98E30" wp14:editId="7C6F82E0">
+              <wp:anchor distT="45720" distB="45720" distL="114300" distR="114300" simplePos="0" relativeHeight="251661312" behindDoc="0" locked="0" layoutInCell="1" allowOverlap="1" wp14:anchorId="6718A005" wp14:editId="1FD7EEF6">
                 <wp:simplePos x="0" y="0"/>
                 <wp:positionH relativeFrom="margin">
-                  <wp:posOffset>1350320</wp:posOffset>
+                  <wp:posOffset>1296199</wp:posOffset>
                 </wp:positionH>
                 <wp:positionV relativeFrom="paragraph">
-                  <wp:posOffset>2540635</wp:posOffset>
-                </wp:positionV>
-                <wp:extent cx="6664325" cy="861060"/>
-                <wp:effectExtent l="0" t="0" r="0" b="0"/>
-                <wp:wrapSquare wrapText="bothSides"/>
-                <wp:docPr id="217" name="Text Box 2"/>
-                <wp:cNvGraphicFramePr>
-                  <a:graphicFrameLocks xmlns:a="http://schemas.openxmlformats.org/drawingml/2006/main"/>
-                </wp:cNvGraphicFramePr>
-                <a:graphic xmlns:a="http://schemas.openxmlformats.org/drawingml/2006/main">
-                  <a:graphicData uri="http://schemas.microsoft.com/office/word/2010/wordprocessingShape">
-                    <wps:wsp>
-                      <wps:cNvSpPr txBox="1">
-                        <a:spLocks noChangeArrowheads="1"/>
-                      </wps:cNvSpPr>
-                      <wps:spPr bwMode="auto">
-                        <a:xfrm>
-                          <a:off x="0" y="0"/>
-                          <a:ext cx="6664325" cy="861060"/>
-                        </a:xfrm>
-                        <a:prstGeom prst="rect">
-                          <a:avLst/>
-                        </a:prstGeom>
-                        <a:noFill/>
-                        <a:ln w="9525">
-                          <a:noFill/>
-                          <a:miter lim="800000"/>
-                          <a:headEnd/>
-                          <a:tailEnd/>
-                        </a:ln>
-                      </wps:spPr>
-                      <wps:txbx>
-                        <w:txbxContent>
-                          <w:p>
-                            <w:pPr>
-                              <w:rPr>
-                                <w:rFonts w:ascii="Segoe Pro" w:hAnsi="Segoe Pro"/>
-                                <w:sz w:val="58"/>
-                                <w:szCs w:val="58"/>
-                              </w:rPr>
-                            </w:pPr>
-                            <w:sdt>
-                              <w:sdtPr>
-                                <w:rPr>
-                                  <w:rFonts w:ascii="Segoe Pro" w:hAnsi="Segoe Pro"/>
-                                  <w:sz w:val="72"/>
-                                  <w:szCs w:val="260"/>
-                                </w:rPr>
-                                <w:id w:val="-164330075"/>
-                                <w:placeholder>
-                                  <w:docPart w:val="DefaultPlaceholder_-1854013440"/>
-                                </w:placeholder>
-                                <w:text/>
-                              </w:sdtPr>
-                              <w:sdtContent>
-                                <w:r>
-                                  <w:rPr>
-                                    <w:rFonts w:ascii="Segoe Pro" w:hAnsi="Segoe Pro"/>
-                                    <w:sz w:val="72"/>
-                                    <w:szCs w:val="260"/>
-                                  </w:rPr>
-                                  <w:t>N</w:t>
-                                </w:r>
-                                <w:r>
-                                  <w:rPr>
-                                    <w:rFonts w:ascii="Segoe Pro" w:hAnsi="Segoe Pro"/>
-                                    <w:sz w:val="72"/>
-                                    <w:szCs w:val="260"/>
-                                  </w:rPr>
-                                  <w:t>ame</w:t>
-                                </w:r>
-                              </w:sdtContent>
-                            </w:sdt>
-                          </w:p>
-                        </w:txbxContent>
-                      </wps:txbx>
-                      <wps:bodyPr rot="0" vert="horz" wrap="square" lIns="91440" tIns="45720" rIns="91440" bIns="45720" anchor="t" anchorCtr="0">
-                        <a:noAutofit/>
-                      </wps:bodyPr>
-                    </wps:wsp>
-                  </a:graphicData>
-                </a:graphic>
-                <wp14:sizeRelH relativeFrom="margin">
-                  <wp14:pctWidth>0</wp14:pctWidth>
-                </wp14:sizeRelH>
-                <wp14:sizeRelV relativeFrom="margin">
-                  <wp14:pctHeight>0</wp14:pctHeight>
-                </wp14:sizeRelV>
-              </wp:anchor>
-            </w:drawing>
-          </mc:Choice>
-          <mc:Fallback>
-            <w:pict>
-              <v:shapetype w14:anchorId="2AE98E30" id="_x0000_t202" coordsize="21600,21600" o:spt="202" path="m,l,21600r21600,l21600,xe">
-                <v:stroke joinstyle="miter"/>
-                <v:path gradientshapeok="t" o:connecttype="rect"/>
-              </v:shapetype>
-              <v:shape id="Text Box 2" o:spid="_x0000_s1026" type="#_x0000_t202" style="position:absolute;left:0;text-align:left;margin-left:106.3pt;margin-top:200.05pt;width:524.75pt;height:67.8pt;z-index:251658240;visibility:visible;mso-wrap-style:square;mso-width-percent:0;mso-height-percent:0;mso-wrap-distance-left:9pt;mso-wrap-distance-top:3.6pt;mso-wrap-distance-right:9pt;mso-wrap-distance-bottom:3.6pt;mso-position-horizontal:absolute;mso-position-horizontal-relative:margin;mso-position-vertical:absolute;mso-position-vertical-relative:text;mso-width-percent:0;mso-height-percent:0;mso-width-relative:margin;mso-height-relative:margin;v-text-anchor:top" o:gfxdata="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" filled="f" stroked="f">
-                <v:textbox>
-                  <w:txbxContent>
-                    <w:p>
-                      <w:pPr>
-                        <w:rPr>
-                          <w:rFonts w:ascii="Segoe Pro" w:hAnsi="Segoe Pro"/>
-                          <w:sz w:val="58"/>
-                          <w:szCs w:val="58"/>
-                        </w:rPr>
-                      </w:pPr>
-                      <w:sdt>
-                        <w:sdtPr>
-                          <w:rPr>
-                            <w:rFonts w:ascii="Segoe Pro" w:hAnsi="Segoe Pro"/>
-                            <w:sz w:val="72"/>
-                            <w:szCs w:val="260"/>
-                          </w:rPr>
-                          <w:id w:val="-164330075"/>
-                          <w:placeholder>
-                            <w:docPart w:val="DefaultPlaceholder_-1854013440"/>
-                          </w:placeholder>
-                          <w:text/>
-                        </w:sdtPr>
-                        <w:sdtContent>
-                          <w:r>
-                            <w:rPr>
-                              <w:rFonts w:ascii="Segoe Pro" w:hAnsi="Segoe Pro"/>
-                              <w:sz w:val="72"/>
-                              <w:szCs w:val="260"/>
-                            </w:rPr>
-                            <w:t>N</w:t>
-                          </w:r>
-                          <w:r>
-                            <w:rPr>
-                              <w:rFonts w:ascii="Segoe Pro" w:hAnsi="Segoe Pro"/>
-                              <w:sz w:val="72"/>
-                              <w:szCs w:val="260"/>
-                            </w:rPr>
-                            <w:t>ame</w:t>
-                          </w:r>
-                        </w:sdtContent>
-                      </w:sdt>
-                    </w:p>
-                  </w:txbxContent>
-                </v:textbox>
-                <w10:wrap type="square" anchorx="margin"/>
-              </v:shape>
-            </w:pict>
-          </mc:Fallback>
-        </mc:AlternateContent>
-      </w:r>
-      <w:r>
-        <w:rPr>
-          <w:noProof/>
-        </w:rPr>
-        <w:drawing>
-          <wp:anchor distT="0" distB="0" distL="114300" distR="114300" simplePos="0" relativeHeight="251662336" behindDoc="1" locked="0" layoutInCell="1" allowOverlap="1" wp14:anchorId="3DF5C24E" wp14:editId="1875E2AA">
-            <wp:simplePos x="0" y="0"/>
-            <wp:positionH relativeFrom="page">
-              <wp:align>left</wp:align>
-            </wp:positionH>
-            <wp:positionV relativeFrom="paragraph">
-              <wp:posOffset>-446804</wp:posOffset>
-            </wp:positionV>
-            <wp:extent cx="10047767" cy="7763334"/>
-            <wp:effectExtent l="0" t="0" r="0" b="9525"/>
-            <wp:wrapNone/>
-            <wp:docPr id="1" name="Graphic 1"/>
-            <wp:cNvGraphicFramePr>
-              <a:graphicFrameLocks xmlns:a="http://schemas.openxmlformats.org/drawingml/2006/main" noChangeAspect="1"/>
-            </wp:cNvGraphicFramePr>
-            <a:graphic xmlns:a="http://schemas.openxmlformats.org/drawingml/2006/main">
-              <a:graphicData uri="http://schemas.openxmlformats.org/drawingml/2006/picture">
-                <pic:pic xmlns:pic="http://schemas.openxmlformats.org/drawingml/2006/picture">
-                  <pic:nvPicPr>
-                    <pic:cNvPr id="1" name=""/>
-                    <pic:cNvPicPr/>
-                  </pic:nvPicPr>
-                  <pic:blipFill>
-                    <a:blip r:embed="rId8">
-                      <a:extLst>
-                        <a:ext uri="{28A0092B-C50C-407E-A947-70E740481C1C}">
-                          <a14:useLocalDpi xmlns:a14="http://schemas.microsoft.com/office/drawing/2010/main" val="0"/>
-                        </a:ext>
-                        <a:ext uri="{96DAC541-7B7A-43D3-8B79-37D633B846F1}">
-                          <asvg:svgBlip xmlns:asvg="http://schemas.microsoft.com/office/drawing/2016/SVG/main" r:embed="rId9"/>
-                        </a:ext>
-                      </a:extLst>
-                    </a:blip>
-                    <a:stretch>
-                      <a:fillRect/>
-                    </a:stretch>
-                  </pic:blipFill>
-                  <pic:spPr>
-                    <a:xfrm>
-                      <a:off x="0" y="0"/>
-                      <a:ext cx="10047767" cy="7763334"/>
-                    </a:xfrm>
-                    <a:prstGeom prst="rect">
-                      <a:avLst/>
-                    </a:prstGeom>
-                  </pic:spPr>
-                </pic:pic>
-              </a:graphicData>
-            </a:graphic>
-            <wp14:sizeRelH relativeFrom="margin">
-              <wp14:pctWidth>0</wp14:pctWidth>
-            </wp14:sizeRelH>
-            <wp14:sizeRelV relativeFrom="margin">
-              <wp14:pctHeight>0</wp14:pctHeight>
-            </wp14:sizeRelV>
-          </wp:anchor>
-        </w:drawing>
-      </w:r>
-      <w:r>
-        <w:rPr>
-          <w:noProof/>
-        </w:rPr>
-        <mc:AlternateContent>
-          <mc:Choice Requires="wps">
-            <w:drawing>
-              <wp:anchor distT="45720" distB="45720" distL="114300" distR="114300" simplePos="0" relativeHeight="251661312" behindDoc="0" locked="0" layoutInCell="1" allowOverlap="1" wp14:anchorId="6718A005" wp14:editId="1F929BB5">
-                <wp:simplePos x="0" y="0"/>
-                <wp:positionH relativeFrom="margin">
-                  <wp:posOffset>1274918</wp:posOffset>
-                </wp:positionH>
-                <wp:positionV relativeFrom="paragraph">
-                  <wp:posOffset>5314950</wp:posOffset>
+                  <wp:posOffset>5416877</wp:posOffset>
                 </wp:positionV>
                 <wp:extent cx="2434590" cy="563245"/>
                 <wp:effectExtent l="0" t="0" r="0" b="0"/>
@@ -288,30 +63,19 @@
                             <w:sdt>
                               <w:sdtPr>
                                 <w:rPr>
-                                  <w:rFonts w:ascii="Segoe Pro" w:hAnsi="Segoe Pro"/>
-                                  <w:sz w:val="42"/>
+                                  <w:sz w:val="32"/>
                                   <w:szCs w:val="32"/>
                                 </w:rPr>
                                 <w:id w:val="573324187"/>
                                 <w:text/>
                               </w:sdtPr>
-                              <w:sdtEndPr/>
                               <w:sdtContent>
                                 <w:r>
                                   <w:rPr>
-                                    <w:rFonts w:ascii="Segoe Pro" w:hAnsi="Segoe Pro"/>
-                                    <w:sz w:val="42"/>
+                                    <w:sz w:val="32"/>
                                     <w:szCs w:val="32"/>
                                   </w:rPr>
-                                  <w:t>Dat</w:t>
-                                </w:r>
-                                <w:r>
-                                  <w:rPr>
-                                    <w:rFonts w:ascii="Segoe Pro" w:hAnsi="Segoe Pro"/>
-                                    <w:sz w:val="42"/>
-                                    <w:szCs w:val="32"/>
-                                  </w:rPr>
-                                  <w:t>e</w:t>
+                                  <w:t>{{date}}</w:t>
                                 </w:r>
                               </w:sdtContent>
                             </w:sdt>
@@ -335,7 +99,11 @@
           </mc:Choice>
           <mc:Fallback>
             <w:pict>
-              <v:shape w14:anchorId="6718A005" id="_x0000_s1027" type="#_x0000_t202" style="position:absolute;left:0;text-align:left;margin-left:100.4pt;margin-top:418.5pt;width:191.7pt;height:44.35pt;z-index:251661312;visibility:visible;mso-wrap-style:square;mso-width-percent:0;mso-height-percent:0;mso-wrap-distance-left:9pt;mso-wrap-distance-top:3.6pt;mso-wrap-distance-right:9pt;mso-wrap-distance-bottom:3.6pt;mso-position-horizontal:absolute;mso-position-horizontal-relative:margin;mso-position-vertical:absolute;mso-position-vertical-relative:text;mso-width-percent:0;mso-height-percent:0;mso-width-relative:margin;mso-height-relative:margin;v-text-anchor:top" o:gfxdata="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" filled="f" stroked="f">
+              <v:shapetype w14:anchorId="6718A005" id="_x0000_t202" coordsize="21600,21600" o:spt="202" path="m,l,21600r21600,l21600,xe">
+                <v:stroke joinstyle="miter"/>
+                <v:path gradientshapeok="t" o:connecttype="rect"/>
+              </v:shapetype>
+              <v:shape id="Text Box 2" o:spid="_x0000_s1026" type="#_x0000_t202" style="position:absolute;left:0;text-align:left;margin-left:102.05pt;margin-top:426.55pt;width:191.7pt;height:44.35pt;z-index:251661312;visibility:visible;mso-wrap-style:square;mso-width-percent:0;mso-height-percent:0;mso-wrap-distance-left:9pt;mso-wrap-distance-top:3.6pt;mso-wrap-distance-right:9pt;mso-wrap-distance-bottom:3.6pt;mso-position-horizontal:absolute;mso-position-horizontal-relative:margin;mso-position-vertical:absolute;mso-position-vertical-relative:text;mso-width-percent:0;mso-height-percent:0;mso-width-relative:margin;mso-height-relative:margin;v-text-anchor:top" o:gfxdata="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" filled="f" stroked="f">
                 <v:textbox>
                   <w:txbxContent>
                     <w:p>
@@ -349,30 +117,220 @@
                       <w:sdt>
                         <w:sdtPr>
                           <w:rPr>
-                            <w:rFonts w:ascii="Segoe Pro" w:hAnsi="Segoe Pro"/>
-                            <w:sz w:val="42"/>
+                            <w:sz w:val="32"/>
                             <w:szCs w:val="32"/>
                           </w:rPr>
                           <w:id w:val="573324187"/>
                           <w:text/>
                         </w:sdtPr>
-                        <w:sdtEndPr/>
                         <w:sdtContent>
                           <w:r>
                             <w:rPr>
-                              <w:rFonts w:ascii="Segoe Pro" w:hAnsi="Segoe Pro"/>
-                              <w:sz w:val="42"/>
+                              <w:sz w:val="32"/>
                               <w:szCs w:val="32"/>
                             </w:rPr>
-                            <w:t>Dat</w:t>
+                            <w:t>{{date}}</w:t>
                           </w:r>
+                        </w:sdtContent>
+                      </w:sdt>
+                    </w:p>
+                  </w:txbxContent>
+                </v:textbox>
+                <w10:wrap type="square" anchorx="margin"/>
+              </v:shape>
+            </w:pict>
+          </mc:Fallback>
+        </mc:AlternateContent>
+      </w:r>
+      <w:r>
+        <w:rPr>
+          <w:noProof/>
+        </w:rPr>
+        <w:drawing>
+          <wp:anchor distT="0" distB="0" distL="114300" distR="114300" simplePos="0" relativeHeight="251662336" behindDoc="1" locked="0" layoutInCell="1" allowOverlap="1" wp14:anchorId="3DF5C24E" wp14:editId="5665ECCE">
+            <wp:simplePos x="0" y="0"/>
+            <wp:positionH relativeFrom="page">
+              <wp:align>left</wp:align>
+            </wp:positionH>
+            <wp:positionV relativeFrom="paragraph">
+              <wp:posOffset>-457199</wp:posOffset>
+            </wp:positionV>
+            <wp:extent cx="10047173" cy="7771928"/>
+            <wp:effectExtent l="0" t="0" r="0" b="635"/>
+            <wp:wrapNone/>
+            <wp:docPr id="1" name="Graphic 1"/>
+            <wp:cNvGraphicFramePr>
+              <a:graphicFrameLocks xmlns:a="http://schemas.openxmlformats.org/drawingml/2006/main" noChangeAspect="1"/>
+            </wp:cNvGraphicFramePr>
+            <a:graphic xmlns:a="http://schemas.openxmlformats.org/drawingml/2006/main">
+              <a:graphicData uri="http://schemas.openxmlformats.org/drawingml/2006/picture">
+                <pic:pic xmlns:pic="http://schemas.openxmlformats.org/drawingml/2006/picture">
+                  <pic:nvPicPr>
+                    <pic:cNvPr id="1" name=""/>
+                    <pic:cNvPicPr/>
+                  </pic:nvPicPr>
+                  <pic:blipFill>
+                    <a:blip r:embed="rId8">
+                      <a:extLst>
+                        <a:ext uri="{28A0092B-C50C-407E-A947-70E740481C1C}">
+                          <a14:useLocalDpi xmlns:a14="http://schemas.microsoft.com/office/drawing/2010/main" val="0"/>
+                        </a:ext>
+                        <a:ext uri="{96DAC541-7B7A-43D3-8B79-37D633B846F1}">
+                          <asvg:svgBlip xmlns:asvg="http://schemas.microsoft.com/office/drawing/2016/SVG/main" r:embed="rId9"/>
+                        </a:ext>
+                      </a:extLst>
+                    </a:blip>
+                    <a:stretch>
+                      <a:fillRect/>
+                    </a:stretch>
+                  </pic:blipFill>
+                  <pic:spPr>
+                    <a:xfrm>
+                      <a:off x="0" y="0"/>
+                      <a:ext cx="10047173" cy="7771928"/>
+                    </a:xfrm>
+                    <a:prstGeom prst="rect">
+                      <a:avLst/>
+                    </a:prstGeom>
+                  </pic:spPr>
+                </pic:pic>
+              </a:graphicData>
+            </a:graphic>
+            <wp14:sizeRelH relativeFrom="margin">
+              <wp14:pctWidth>0</wp14:pctWidth>
+            </wp14:sizeRelH>
+            <wp14:sizeRelV relativeFrom="margin">
+              <wp14:pctHeight>0</wp14:pctHeight>
+            </wp14:sizeRelV>
+          </wp:anchor>
+        </w:drawing>
+      </w:r>
+      <w:r>
+        <w:rPr>
+          <w:noProof/>
+        </w:rPr>
+        <mc:AlternateContent>
+          <mc:Choice Requires="wps">
+            <w:drawing>
+              <wp:anchor distT="45720" distB="45720" distL="114300" distR="114300" simplePos="0" relativeHeight="251658240" behindDoc="0" locked="0" layoutInCell="1" allowOverlap="1" wp14:anchorId="2AE98E30" wp14:editId="6DE9CC1A">
+                <wp:simplePos x="0" y="0"/>
+                <wp:positionH relativeFrom="margin">
+                  <wp:posOffset>1350320</wp:posOffset>
+                </wp:positionH>
+                <wp:positionV relativeFrom="paragraph">
+                  <wp:posOffset>2540635</wp:posOffset>
+                </wp:positionV>
+                <wp:extent cx="6664325" cy="861060"/>
+                <wp:effectExtent l="0" t="0" r="0" b="0"/>
+                <wp:wrapSquare wrapText="bothSides"/>
+                <wp:docPr id="217" name="Text Box 2"/>
+                <wp:cNvGraphicFramePr>
+                  <a:graphicFrameLocks xmlns:a="http://schemas.openxmlformats.org/drawingml/2006/main"/>
+                </wp:cNvGraphicFramePr>
+                <a:graphic xmlns:a="http://schemas.openxmlformats.org/drawingml/2006/main">
+                  <a:graphicData uri="http://schemas.microsoft.com/office/word/2010/wordprocessingShape">
+                    <wps:wsp>
+                      <wps:cNvSpPr txBox="1">
+                        <a:spLocks noChangeArrowheads="1"/>
+                      </wps:cNvSpPr>
+                      <wps:spPr bwMode="auto">
+                        <a:xfrm>
+                          <a:off x="0" y="0"/>
+                          <a:ext cx="6664325" cy="861060"/>
+                        </a:xfrm>
+                        <a:prstGeom prst="rect">
+                          <a:avLst/>
+                        </a:prstGeom>
+                        <a:noFill/>
+                        <a:ln w="9525">
+                          <a:noFill/>
+                          <a:miter lim="800000"/>
+                          <a:headEnd/>
+                          <a:tailEnd/>
+                        </a:ln>
+                      </wps:spPr>
+                      <wps:txbx>
+                        <w:txbxContent>
+                          <w:p>
+                            <w:pPr>
+                              <w:rPr>
+                                <w:rFonts w:ascii="Segoe Pro" w:hAnsi="Segoe Pro"/>
+                                <w:sz w:val="80"/>
+                                <w:szCs w:val="80"/>
+                              </w:rPr>
+                            </w:pPr>
+                            <w:sdt>
+                              <w:sdtPr>
+                                <w:rPr>
+                                  <w:sz w:val="84"/>
+                                  <w:szCs w:val="84"/>
+                                </w:rPr>
+                                <w:id w:val="-164330075"/>
+                                <w:placeholder>
+                                  <w:docPart w:val="DefaultPlaceholder_-1854013440"/>
+                                </w:placeholder>
+                                <w:text/>
+                              </w:sdtPr>
+                              <w:sdtContent>
+                                <w:r>
+                                  <w:rPr>
+                                    <w:sz w:val="84"/>
+                                    <w:szCs w:val="84"/>
+                                  </w:rPr>
+                                  <w:t>{{name}}</w:t>
+                                </w:r>
+                              </w:sdtContent>
+                            </w:sdt>
+                          </w:p>
+                        </w:txbxContent>
+                      </wps:txbx>
+                      <wps:bodyPr rot="0" vert="horz" wrap="square" lIns="91440" tIns="45720" rIns="91440" bIns="45720" anchor="t" anchorCtr="0">
+                        <a:noAutofit/>
+                      </wps:bodyPr>
+                    </wps:wsp>
+                  </a:graphicData>
+                </a:graphic>
+                <wp14:sizeRelH relativeFrom="margin">
+                  <wp14:pctWidth>0</wp14:pctWidth>
+                </wp14:sizeRelH>
+                <wp14:sizeRelV relativeFrom="margin">
+                  <wp14:pctHeight>0</wp14:pctHeight>
+                </wp14:sizeRelV>
+              </wp:anchor>
+            </w:drawing>
+          </mc:Choice>
+          <mc:Fallback>
+            <w:pict>
+              <v:shape w14:anchorId="2AE98E30" id="_x0000_s1027" type="#_x0000_t202" style="position:absolute;left:0;text-align:left;margin-left:106.3pt;margin-top:200.05pt;width:524.75pt;height:67.8pt;z-index:251658240;visibility:visible;mso-wrap-style:square;mso-width-percent:0;mso-height-percent:0;mso-wrap-distance-left:9pt;mso-wrap-distance-top:3.6pt;mso-wrap-distance-right:9pt;mso-wrap-distance-bottom:3.6pt;mso-position-horizontal:absolute;mso-position-horizontal-relative:margin;mso-position-vertical:absolute;mso-position-vertical-relative:text;mso-width-percent:0;mso-height-percent:0;mso-width-relative:margin;mso-height-relative:margin;v-text-anchor:top" o:gfxdata="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" filled="f" stroked="f">
+                <v:textbox>
+                  <w:txbxContent>
+                    <w:p>
+                      <w:pPr>
+                        <w:rPr>
+                          <w:rFonts w:ascii="Segoe Pro" w:hAnsi="Segoe Pro"/>
+                          <w:sz w:val="80"/>
+                          <w:szCs w:val="80"/>
+                        </w:rPr>
+                      </w:pPr>
+                      <w:sdt>
+                        <w:sdtPr>
+                          <w:rPr>
+                            <w:sz w:val="84"/>
+                            <w:szCs w:val="84"/>
+                          </w:rPr>
+                          <w:id w:val="-164330075"/>
+                          <w:placeholder>
+                            <w:docPart w:val="DefaultPlaceholder_-1854013440"/>
+                          </w:placeholder>
+                          <w:text/>
+                        </w:sdtPr>
+                        <w:sdtContent>
                           <w:r>
                             <w:rPr>
-                              <w:rFonts w:ascii="Segoe Pro" w:hAnsi="Segoe Pro"/>
-                              <w:sz w:val="42"/>
-                              <w:szCs w:val="32"/>
+                              <w:sz w:val="84"/>
+                              <w:szCs w:val="84"/>
                             </w:rPr>
-                            <w:t>e</w:t>
+                            <w:t>{{name}}</w:t>
                           </w:r>
                         </w:sdtContent>
                       </w:sdt>
@@ -1329,600 +1287,6 @@
 </w:styles>
 </file>
 
-<file path=word/glossary/document.xml><?xml version="1.0" encoding="utf-8"?>
-<w:glossaryDocument xmlns:wpc="http://schemas.microsoft.com/office/word/2010/wordprocessingCanvas" xmlns:cx="http://schemas.microsoft.com/office/drawing/2014/chartex" xmlns:cx1="http://schemas.microsoft.com/office/drawing/2015/9/8/chartex" xmlns:cx2="http://schemas.microsoft.com/office/drawing/2015/10/21/chartex" xmlns:cx3="http://schemas.microsoft.com/office/drawing/2016/5/9/chartex" xmlns:cx4="http://schemas.microsoft.com/office/drawing/2016/5/10/chartex" xmlns:cx5="http://schemas.microsoft.com/office/drawing/2016/5/11/chartex" xmlns:cx6="http://schemas.microsoft.com/office/drawing/2016/5/12/chartex" xmlns:cx7="http://schemas.microsoft.com/office/drawing/2016/5/13/chartex" xmlns:cx8="http://schemas.microsoft.com/office/drawing/2016/5/14/chartex" xmlns:mc="http://schemas.openxmlformats.org/markup-compatibility/2006" xmlns:aink="http://schemas.microsoft.com/office/drawing/2016/ink" xmlns:am3d="http://schemas.microsoft.com/office/drawing/2017/model3d" xmlns:o="urn:schemas-microsoft-com:office:office" xmlns:r="http://schemas.openxmlformats.org/officeDocument/2006/relationships" xmlns:m="http://schemas.openxmlformats.org/officeDocument/2006/math" xmlns:v="urn:schemas-microsoft-com:vml" xmlns:wp14="http://schemas.microsoft.com/office/word/2010/wordprocessingDrawing" xmlns:wp="http://schemas.openxmlformats.org/drawingml/2006/wordprocessingDrawing" xmlns:w10="urn:schemas-microsoft-com:office:word" xmlns:w="http://schemas.openxmlformats.org/wordprocessingml/2006/main" xmlns:w14="http://schemas.microsoft.com/office/word/2010/wordml" xmlns:w15="http://schemas.microsoft.com/office/word/2012/wordml" xmlns:w16cex="http://schemas.microsoft.com/office/word/2018/wordml/cex" xmlns:w16cid="http://schemas.microsoft.com/office/word/2016/wordml/cid" xmlns:w16="http://schemas.microsoft.com/office/word/2018/wordml" xmlns:w16sdtdh="http://schemas.microsoft.com/office/word/2020/wordml/sdtdatahash" xmlns:w16se="http://schemas.microsoft.com/office/word/2015/wordml/symex" xmlns:wpg="http://schemas.microsoft.com/office/word/2010/wordprocessingGroup" xmlns:wpi="http://schemas.microsoft.com/office/word/2010/wordprocessingInk" xmlns:wne="http://schemas.microsoft.com/office/word/2006/wordml" xmlns:wps="http://schemas.microsoft.com/office/word/2010/wordprocessingShape" mc:Ignorable="w14 w15 w16se w16cid w16 w16cex w16sdtdh wp14">
-  <w:docParts>
-    <w:docPart>
-      <w:docPartPr>
-        <w:name w:val="DefaultPlaceholder_-1854013440"/>
-        <w:category>
-          <w:name w:val="General"/>
-          <w:gallery w:val="placeholder"/>
-        </w:category>
-        <w:types>
-          <w:type w:val="bbPlcHdr"/>
-        </w:types>
-        <w:behaviors>
-          <w:behavior w:val="content"/>
-        </w:behaviors>
-        <w:guid w:val="{F2D807E8-20D5-49C9-9876-B338A2F7CA91}"/>
-      </w:docPartPr>
-      <w:docPartBody>
-        <w:p>
-          <w:r>
-            <w:rPr>
-              <w:rStyle w:val="PlaceholderText"/>
-            </w:rPr>
-            <w:t>Click or tap here to enter text.</w:t>
-          </w:r>
-        </w:p>
-      </w:docPartBody>
-    </w:docPart>
-  </w:docParts>
-</w:glossaryDocument>
-</file>
-
-<file path=word/glossary/fontTable.xml><?xml version="1.0" encoding="utf-8"?>
-<w:fonts xmlns:mc="http://schemas.openxmlformats.org/markup-compatibility/2006" xmlns:r="http://schemas.openxmlformats.org/officeDocument/2006/relationships" xmlns:w="http://schemas.openxmlformats.org/wordprocessingml/2006/main" xmlns:w14="http://schemas.microsoft.com/office/word/2010/wordml" xmlns:w15="http://schemas.microsoft.com/office/word/2012/wordml" xmlns:w16cex="http://schemas.microsoft.com/office/word/2018/wordml/cex" xmlns:w16cid="http://schemas.microsoft.com/office/word/2016/wordml/cid" xmlns:w16="http://schemas.microsoft.com/office/word/2018/wordml" xmlns:w16sdtdh="http://schemas.microsoft.com/office/word/2020/wordml/sdtdatahash" xmlns:w16se="http://schemas.microsoft.com/office/word/2015/wordml/symex" mc:Ignorable="w14 w15 w16se w16cid w16 w16cex w16sdtdh">
-  <w:font w:name="Calibri">
-    <w:panose1 w:val="020F0502020204030204"/>
-    <w:charset w:val="00"/>
-    <w:family w:val="swiss"/>
-    <w:pitch w:val="variable"/>
-    <w:sig w:usb0="E4002EFF" w:usb1="C200247B" w:usb2="00000009" w:usb3="00000000" w:csb0="000001FF" w:csb1="00000000"/>
-  </w:font>
-  <w:font w:name="Iskoola Pota">
-    <w:charset w:val="00"/>
-    <w:family w:val="swiss"/>
-    <w:pitch w:val="variable"/>
-    <w:sig w:usb0="00000003" w:usb1="00000000" w:usb2="00000200" w:usb3="00000000" w:csb0="00000001" w:csb1="00000000"/>
-  </w:font>
-  <w:font w:name="Times New Roman">
-    <w:panose1 w:val="02020603050405020304"/>
-    <w:charset w:val="00"/>
-    <w:family w:val="roman"/>
-    <w:pitch w:val="variable"/>
-    <w:sig w:usb0="E0002EFF" w:usb1="C000785B" w:usb2="00000009" w:usb3="00000000" w:csb0="000001FF" w:csb1="00000000"/>
-  </w:font>
-  <w:font w:name="Calibri Light">
-    <w:panose1 w:val="020F0302020204030204"/>
-    <w:charset w:val="00"/>
-    <w:family w:val="swiss"/>
-    <w:pitch w:val="variable"/>
-    <w:sig w:usb0="E4002EFF" w:usb1="C200247B" w:usb2="00000009" w:usb3="00000000" w:csb0="000001FF" w:csb1="00000000"/>
-  </w:font>
-  <w:font w:name="Segoe Pro">
-    <w:altName w:val="Segoe UI"/>
-    <w:charset w:val="00"/>
-    <w:family w:val="swiss"/>
-    <w:pitch w:val="variable"/>
-    <w:sig w:usb0="A00002AF" w:usb1="4000205B" w:usb2="00000000" w:usb3="00000000" w:csb0="0000009F" w:csb1="00000000"/>
-  </w:font>
-</w:fonts>
-</file>
-
-<file path=word/glossary/settings.xml><?xml version="1.0" encoding="utf-8"?>
-<w:settings xmlns:mc="http://schemas.openxmlformats.org/markup-compatibility/2006" xmlns:o="urn:schemas-microsoft-com:office:office" xmlns:r="http://schemas.openxmlformats.org/officeDocument/2006/relationships" xmlns:m="http://schemas.openxmlformats.org/officeDocument/2006/math" xmlns:v="urn:schemas-microsoft-com:vml" xmlns:w10="urn:schemas-microsoft-com:office:word" xmlns:w="http://schemas.openxmlformats.org/wordprocessingml/2006/main" xmlns:w14="http://schemas.microsoft.com/office/word/2010/wordml" xmlns:w15="http://schemas.microsoft.com/office/word/2012/wordml" xmlns:w16cex="http://schemas.microsoft.com/office/word/2018/wordml/cex" xmlns:w16cid="http://schemas.microsoft.com/office/word/2016/wordml/cid" xmlns:w16="http://schemas.microsoft.com/office/word/2018/wordml" xmlns:w16sdtdh="http://schemas.microsoft.com/office/word/2020/wordml/sdtdatahash" xmlns:w16se="http://schemas.microsoft.com/office/word/2015/wordml/symex" xmlns:sl="http://schemas.openxmlformats.org/schemaLibrary/2006/main" mc:Ignorable="w14 w15 w16se w16cid w16 w16cex w16sdtdh">
-  <w:view w:val="normal"/>
-  <w:defaultTabStop w:val="720"/>
-  <w:characterSpacingControl w:val="doNotCompress"/>
-  <w:compat>
-    <w:useFELayout/>
-    <w:compatSetting w:name="compatibilityMode" w:uri="http://schemas.microsoft.com/office/word" w:val="15"/>
-    <w:compatSetting w:name="overrideTableStyleFontSizeAndJustification" w:uri="http://schemas.microsoft.com/office/word" w:val="1"/>
-    <w:compatSetting w:name="enableOpenTypeFeatures" w:uri="http://schemas.microsoft.com/office/word" w:val="1"/>
-    <w:compatSetting w:name="doNotFlipMirrorIndents" w:uri="http://schemas.microsoft.com/office/word" w:val="1"/>
-    <w:compatSetting w:name="differentiateMultirowTableHeaders" w:uri="http://schemas.microsoft.com/office/word" w:val="1"/>
-    <w:compatSetting w:name="useWord2013TrackBottomHyphenation" w:uri="http://schemas.microsoft.com/office/word" w:val="0"/>
-  </w:compat>
-  <w:rsids>
-    <w:rsidRoot w:val="008829A5"/>
-    <w:rsid w:val="00047537"/>
-    <w:rsid w:val="00082B64"/>
-    <w:rsid w:val="001F5799"/>
-    <w:rsid w:val="001F63C9"/>
-    <w:rsid w:val="002354B5"/>
-    <w:rsid w:val="00254EEE"/>
-    <w:rsid w:val="00275F7F"/>
-    <w:rsid w:val="002B0936"/>
-    <w:rsid w:val="00300A12"/>
-    <w:rsid w:val="00337A9D"/>
-    <w:rsid w:val="003572A4"/>
-    <w:rsid w:val="004F39A3"/>
-    <w:rsid w:val="005405A7"/>
-    <w:rsid w:val="005A4740"/>
-    <w:rsid w:val="005A638C"/>
-    <w:rsid w:val="00703CCC"/>
-    <w:rsid w:val="0072113B"/>
-    <w:rsid w:val="00726BD5"/>
-    <w:rsid w:val="00731306"/>
-    <w:rsid w:val="007F4E3D"/>
-    <w:rsid w:val="008209B6"/>
-    <w:rsid w:val="00873ADA"/>
-    <w:rsid w:val="008829A5"/>
-    <w:rsid w:val="00975C0B"/>
-    <w:rsid w:val="009D310D"/>
-    <w:rsid w:val="00B47870"/>
-    <w:rsid w:val="00C256B3"/>
-    <w:rsid w:val="00C6328F"/>
-    <w:rsid w:val="00CE0AA3"/>
-    <w:rsid w:val="00D93F94"/>
-    <w:rsid w:val="00E0040E"/>
-    <w:rsid w:val="00E745D3"/>
-    <w:rsid w:val="00E95945"/>
-    <w:rsid w:val="00F043EA"/>
-    <w:rsid w:val="00F1221B"/>
-    <w:rsid w:val="00FA10E9"/>
-  </w:rsids>
-  <m:mathPr>
-    <m:mathFont m:val="Cambria Math"/>
-    <m:brkBin m:val="before"/>
-    <m:brkBinSub m:val="--"/>
-    <m:smallFrac m:val="0"/>
-    <m:dispDef/>
-    <m:lMargin m:val="0"/>
-    <m:rMargin m:val="0"/>
-    <m:defJc m:val="centerGroup"/>
-    <m:wrapIndent m:val="1440"/>
-    <m:intLim m:val="subSup"/>
-    <m:naryLim m:val="undOvr"/>
-  </m:mathPr>
-  <w:themeFontLang w:val="en-GB" w:bidi="si-LK"/>
-  <w:clrSchemeMapping w:bg1="light1" w:t1="dark1" w:bg2="light2" w:t2="dark2" w:accent1="accent1" w:accent2="accent2" w:accent3="accent3" w:accent4="accent4" w:accent5="accent5" w:accent6="accent6" w:hyperlink="hyperlink" w:followedHyperlink="followedHyperlink"/>
-  <w:decimalSymbol w:val="."/>
-  <w:listSeparator w:val=","/>
-  <w15:chartTrackingRefBased/>
-</w:settings>
-</file>
-
-<file path=word/glossary/styles.xml><?xml version="1.0" encoding="utf-8"?>
-<w:styles xmlns:mc="http://schemas.openxmlformats.org/markup-compatibility/2006" xmlns:r="http://schemas.openxmlformats.org/officeDocument/2006/relationships" xmlns:w="http://schemas.openxmlformats.org/wordprocessingml/2006/main" xmlns:w14="http://schemas.microsoft.com/office/word/2010/wordml" xmlns:w15="http://schemas.microsoft.com/office/word/2012/wordml" xmlns:w16cex="http://schemas.microsoft.com/office/word/2018/wordml/cex" xmlns:w16cid="http://schemas.microsoft.com/office/word/2016/wordml/cid" xmlns:w16="http://schemas.microsoft.com/office/word/2018/wordml" xmlns:w16sdtdh="http://schemas.microsoft.com/office/word/2020/wordml/sdtdatahash" xmlns:w16se="http://schemas.microsoft.com/office/word/2015/wordml/symex" mc:Ignorable="w14 w15 w16se w16cid w16 w16cex w16sdtdh">
-  <w:docDefaults>
-    <w:rPrDefault>
-      <w:rPr>
-        <w:rFonts w:asciiTheme="minorHAnsi" w:eastAsiaTheme="minorEastAsia" w:hAnsiTheme="minorHAnsi" w:cstheme="minorBidi"/>
-        <w:kern w:val="2"/>
-        <w:sz w:val="24"/>
-        <w:szCs w:val="24"/>
-        <w:lang w:val="en-GB" w:eastAsia="en-GB" w:bidi="ar-SA"/>
-        <w14:ligatures w14:val="standardContextual"/>
-      </w:rPr>
-    </w:rPrDefault>
-    <w:pPrDefault>
-      <w:pPr>
-        <w:spacing w:after="160" w:line="278" w:lineRule="auto"/>
-      </w:pPr>
-    </w:pPrDefault>
-  </w:docDefaults>
-  <w:latentStyles w:defLockedState="0" w:defUIPriority="99" w:defSemiHidden="0" w:defUnhideWhenUsed="0" w:defQFormat="0" w:count="376">
-    <w:lsdException w:name="Normal" w:uiPriority="0" w:qFormat="1"/>
-    <w:lsdException w:name="heading 1" w:uiPriority="9" w:qFormat="1"/>
-    <w:lsdException w:name="heading 2" w:semiHidden="1" w:uiPriority="9" w:unhideWhenUsed="1" w:qFormat="1"/>
-    <w:lsdException w:name="heading 3" w:semiHidden="1" w:uiPriority="9" w:unhideWhenUsed="1" w:qFormat="1"/>
-    <w:lsdException w:name="heading 4" w:semiHidden="1" w:uiPriority="9" w:unhideWhenUsed="1" w:qFormat="1"/>
-    <w:lsdException w:name="heading 5" w:semiHidden="1" w:uiPriority="9" w:unhideWhenUsed="1" w:qFormat="1"/>
-    <w:lsdException w:name="heading 6" w:semiHidden="1" w:uiPriority="9" w:unhideWhenUsed="1" w:qFormat="1"/>
-    <w:lsdException w:name="heading 7" w:semiHidden="1" w:uiPriority="9" w:unhideWhenUsed="1" w:qFormat="1"/>
-    <w:lsdException w:name="heading 8" w:semiHidden="1" w:uiPriority="9" w:unhideWhenUsed="1" w:qFormat="1"/>
-    <w:lsdException w:name="heading 9" w:semiHidden="1" w:uiPriority="9" w:unhideWhenUsed="1" w:qFormat="1"/>
-    <w:lsdException w:name="index 1" w:semiHidden="1" w:unhideWhenUsed="1"/>
-    <w:lsdException w:name="index 2" w:semiHidden="1" w:unhideWhenUsed="1"/>
-    <w:lsdException w:name="index 3" w:semiHidden="1" w:unhideWhenUsed="1"/>
-    <w:lsdException w:name="index 4" w:semiHidden="1" w:unhideWhenUsed="1"/>
-    <w:lsdException w:name="index 5" w:semiHidden="1" w:unhideWhenUsed="1"/>
-    <w:lsdException w:name="index 6" w:semiHidden="1" w:unhideWhenUsed="1"/>
-    <w:lsdException w:name="index 7" w:semiHidden="1" w:unhideWhenUsed="1"/>
-    <w:lsdException w:name="index 8" w:semiHidden="1" w:unhideWhenUsed="1"/>
-    <w:lsdException w:name="index 9" w:semiHidden="1" w:unhideWhenUsed="1"/>
-    <w:lsdException w:name="toc 1" w:semiHidden="1" w:uiPriority="39" w:unhideWhenUsed="1"/>
-    <w:lsdException w:name="toc 2" w:semiHidden="1" w:uiPriority="39" w:unhideWhenUsed="1"/>
-    <w:lsdException w:name="toc 3" w:semiHidden="1" w:uiPriority="39" w:unhideWhenUsed="1"/>
-    <w:lsdException w:name="toc 4" w:semiHidden="1" w:uiPriority="39" w:unhideWhenUsed="1"/>
-    <w:lsdException w:name="toc 5" w:semiHidden="1" w:uiPriority="39" w:unhideWhenUsed="1"/>
-    <w:lsdException w:name="toc 6" w:semiHidden="1" w:uiPriority="39" w:unhideWhenUsed="1"/>
-    <w:lsdException w:name="toc 7" w:semiHidden="1" w:uiPriority="39" w:unhideWhenUsed="1"/>
-    <w:lsdException w:name="toc 8" w:semiHidden="1" w:uiPriority="39" w:unhideWhenUsed="1"/>
-    <w:lsdException w:name="toc 9" w:semiHidden="1" w:uiPriority="39" w:unhideWhenUsed="1"/>
-    <w:lsdException w:name="Normal Indent" w:semiHidden="1" w:unhideWhenUsed="1"/>
-    <w:lsdException w:name="footnote text" w:semiHidden="1" w:unhideWhenUsed="1"/>
-    <w:lsdException w:name="annotation text" w:semiHidden="1" w:unhideWhenUsed="1"/>
-    <w:lsdException w:name="header" w:semiHidden="1" w:unhideWhenUsed="1"/>
-    <w:lsdException w:name="footer" w:semiHidden="1" w:unhideWhenUsed="1"/>
-    <w:lsdException w:name="index heading" w:semiHidden="1" w:unhideWhenUsed="1"/>
-    <w:lsdException w:name="caption" w:semiHidden="1" w:uiPriority="35" w:unhideWhenUsed="1" w:qFormat="1"/>
-    <w:lsdException w:name="table of figures" w:semiHidden="1" w:unhideWhenUsed="1"/>
-    <w:lsdException w:name="envelope address" w:semiHidden="1" w:unhideWhenUsed="1"/>
-    <w:lsdException w:name="envelope return" w:semiHidden="1" w:unhideWhenUsed="1"/>
-    <w:lsdException w:name="footnote reference" w:semiHidden="1" w:unhideWhenUsed="1"/>
-    <w:lsdException w:name="annotation reference" w:semiHidden="1" w:unhideWhenUsed="1"/>
-    <w:lsdException w:name="line number" w:semiHidden="1" w:unhideWhenUsed="1"/>
-    <w:lsdException w:name="page number" w:semiHidden="1" w:unhideWhenUsed="1"/>
-    <w:lsdException w:name="endnote reference" w:semiHidden="1" w:unhideWhenUsed="1"/>
-    <w:lsdException w:name="endnote text" w:semiHidden="1" w:unhideWhenUsed="1"/>
-    <w:lsdException w:name="table of authorities" w:semiHidden="1" w:unhideWhenUsed="1"/>
-    <w:lsdException w:name="macro" w:semiHidden="1" w:unhideWhenUsed="1"/>
-    <w:lsdException w:name="toa heading" w:semiHidden="1" w:unhideWhenUsed="1"/>
-    <w:lsdException w:name="List" w:semiHidden="1" w:unhideWhenUsed="1"/>
-    <w:lsdException w:name="List Bullet" w:semiHidden="1" w:unhideWhenUsed="1"/>
-    <w:lsdException w:name="List Number" w:semiHidden="1" w:unhideWhenUsed="1"/>
-    <w:lsdException w:name="List 2" w:semiHidden="1" w:unhideWhenUsed="1"/>
-    <w:lsdException w:name="List 3" w:semiHidden="1" w:unhideWhenUsed="1"/>
-    <w:lsdException w:name="List 4" w:semiHidden="1" w:unhideWhenUsed="1"/>
-    <w:lsdException w:name="List 5" w:semiHidden="1" w:unhideWhenUsed="1"/>
-    <w:lsdException w:name="List Bullet 2" w:semiHidden="1" w:unhideWhenUsed="1"/>
-    <w:lsdException w:name="List Bullet 3" w:semiHidden="1" w:unhideWhenUsed="1"/>
-    <w:lsdException w:name="List Bullet 4" w:semiHidden="1" w:unhideWhenUsed="1"/>
-    <w:lsdException w:name="List Bullet 5" w:semiHidden="1" w:unhideWhenUsed="1"/>
-    <w:lsdException w:name="List Number 2" w:semiHidden="1" w:unhideWhenUsed="1"/>
-    <w:lsdException w:name="List Number 3" w:semiHidden="1" w:unhideWhenUsed="1"/>
-    <w:lsdException w:name="List Number 4" w:semiHidden="1" w:unhideWhenUsed="1"/>
-    <w:lsdException w:name="List Number 5" w:semiHidden="1" w:unhideWhenUsed="1"/>
-    <w:lsdException w:name="Title" w:uiPriority="10" w:qFormat="1"/>
-    <w:lsdException w:name="Closing" w:semiHidden="1" w:unhideWhenUsed="1"/>
-    <w:lsdException w:name="Signature" w:semiHidden="1" w:unhideWhenUsed="1"/>
-    <w:lsdException w:name="Default Paragraph Font" w:semiHidden="1" w:uiPriority="1" w:unhideWhenUsed="1"/>
-    <w:lsdException w:name="Body Text" w:semiHidden="1" w:unhideWhenUsed="1"/>
-    <w:lsdException w:name="Body Text Indent" w:semiHidden="1" w:unhideWhenUsed="1"/>
-    <w:lsdException w:name="List Continue" w:semiHidden="1" w:unhideWhenUsed="1"/>
-    <w:lsdException w:name="List Continue 2" w:semiHidden="1" w:unhideWhenUsed="1"/>
-    <w:lsdException w:name="List Continue 3" w:semiHidden="1" w:unhideWhenUsed="1"/>
-    <w:lsdException w:name="List Continue 4" w:semiHidden="1" w:unhideWhenUsed="1"/>
-    <w:lsdException w:name="List Continue 5" w:semiHidden="1" w:unhideWhenUsed="1"/>
-    <w:lsdException w:name="Message Header" w:semiHidden="1" w:unhideWhenUsed="1"/>
-    <w:lsdException w:name="Subtitle" w:uiPriority="11" w:qFormat="1"/>
-    <w:lsdException w:name="Salutation" w:semiHidden="1" w:unhideWhenUsed="1"/>
-    <w:lsdException w:name="Date" w:semiHidden="1" w:unhideWhenUsed="1"/>
-    <w:lsdException w:name="Body Text First Indent" w:semiHidden="1" w:unhideWhenUsed="1"/>
-    <w:lsdException w:name="Body Text First Indent 2" w:semiHidden="1" w:unhideWhenUsed="1"/>
-    <w:lsdException w:name="Note Heading" w:semiHidden="1" w:unhideWhenUsed="1"/>
-    <w:lsdException w:name="Body Text 2" w:semiHidden="1" w:unhideWhenUsed="1"/>
-    <w:lsdException w:name="Body Text 3" w:semiHidden="1" w:unhideWhenUsed="1"/>
-    <w:lsdException w:name="Body Text Indent 2" w:semiHidden="1" w:unhideWhenUsed="1"/>
-    <w:lsdException w:name="Body Text Indent 3" w:semiHidden="1" w:unhideWhenUsed="1"/>
-    <w:lsdException w:name="Block Text" w:semiHidden="1" w:unhideWhenUsed="1"/>
-    <w:lsdException w:name="Hyperlink" w:semiHidden="1" w:unhideWhenUsed="1"/>
-    <w:lsdException w:name="FollowedHyperlink" w:semiHidden="1" w:unhideWhenUsed="1"/>
-    <w:lsdException w:name="Strong" w:uiPriority="22" w:qFormat="1"/>
-    <w:lsdException w:name="Emphasis" w:uiPriority="20" w:qFormat="1"/>
-    <w:lsdException w:name="Document Map" w:semiHidden="1" w:unhideWhenUsed="1"/>
-    <w:lsdException w:name="Plain Text" w:semiHidden="1" w:unhideWhenUsed="1"/>
-    <w:lsdException w:name="E-mail Signature" w:semiHidden="1" w:unhideWhenUsed="1"/>
-    <w:lsdException w:name="HTML Top of Form" w:semiHidden="1" w:unhideWhenUsed="1"/>
-    <w:lsdException w:name="HTML Bottom of Form" w:semiHidden="1" w:unhideWhenUsed="1"/>
-    <w:lsdException w:name="Normal (Web)" w:semiHidden="1" w:unhideWhenUsed="1"/>
-    <w:lsdException w:name="HTML Acronym" w:semiHidden="1" w:unhideWhenUsed="1"/>
-    <w:lsdException w:name="HTML Address" w:semiHidden="1" w:unhideWhenUsed="1"/>
-    <w:lsdException w:name="HTML Cite" w:semiHidden="1" w:unhideWhenUsed="1"/>
-    <w:lsdException w:name="HTML Code" w:semiHidden="1" w:unhideWhenUsed="1"/>
-    <w:lsdException w:name="HTML Definition" w:semiHidden="1" w:unhideWhenUsed="1"/>
-    <w:lsdException w:name="HTML Keyboard" w:semiHidden="1" w:unhideWhenUsed="1"/>
-    <w:lsdException w:name="HTML Preformatted" w:semiHidden="1" w:unhideWhenUsed="1"/>
-    <w:lsdException w:name="HTML Sample" w:semiHidden="1" w:unhideWhenUsed="1"/>
-    <w:lsdException w:name="HTML Typewriter" w:semiHidden="1" w:unhideWhenUsed="1"/>
-    <w:lsdException w:name="HTML Variable" w:semiHidden="1" w:unhideWhenUsed="1"/>
-    <w:lsdException w:name="Normal Table" w:semiHidden="1" w:unhideWhenUsed="1"/>
-    <w:lsdException w:name="annotation subject" w:semiHidden="1" w:unhideWhenUsed="1"/>
-    <w:lsdException w:name="No List" w:semiHidden="1" w:unhideWhenUsed="1"/>
-    <w:lsdException w:name="Outline List 1" w:semiHidden="1" w:unhideWhenUsed="1"/>
-    <w:lsdException w:name="Outline List 2" w:semiHidden="1" w:unhideWhenUsed="1"/>
-    <w:lsdException w:name="Outline List 3" w:semiHidden="1" w:unhideWhenUsed="1"/>
-    <w:lsdException w:name="Table Simple 1" w:semiHidden="1" w:unhideWhenUsed="1"/>
-    <w:lsdException w:name="Table Simple 2" w:semiHidden="1" w:unhideWhenUsed="1"/>
-    <w:lsdException w:name="Table Simple 3" w:semiHidden="1" w:unhideWhenUsed="1"/>
-    <w:lsdException w:name="Table Classic 1" w:semiHidden="1" w:unhideWhenUsed="1"/>
-    <w:lsdException w:name="Table Classic 2" w:semiHidden="1" w:unhideWhenUsed="1"/>
-    <w:lsdException w:name="Table Classic 3" w:semiHidden="1" w:unhideWhenUsed="1"/>
-    <w:lsdException w:name="Table Classic 4" w:semiHidden="1" w:unhideWhenUsed="1"/>
-    <w:lsdException w:name="Table Colorful 1" w:semiHidden="1" w:unhideWhenUsed="1"/>
-    <w:lsdException w:name="Table Colorful 2" w:semiHidden="1" w:unhideWhenUsed="1"/>
-    <w:lsdException w:name="Table Colorful 3" w:semiHidden="1" w:unhideWhenUsed="1"/>
-    <w:lsdException w:name="Table Columns 1" w:semiHidden="1" w:unhideWhenUsed="1"/>
-    <w:lsdException w:name="Table Columns 2" w:semiHidden="1" w:unhideWhenUsed="1"/>
-    <w:lsdException w:name="Table Columns 3" w:semiHidden="1" w:unhideWhenUsed="1"/>
-    <w:lsdException w:name="Table Columns 4" w:semiHidden="1" w:unhideWhenUsed="1"/>
-    <w:lsdException w:name="Table Columns 5" w:semiHidden="1" w:unhideWhenUsed="1"/>
-    <w:lsdException w:name="Table Grid 1" w:semiHidden="1" w:unhideWhenUsed="1"/>
-    <w:lsdException w:name="Table Grid 2" w:semiHidden="1" w:unhideWhenUsed="1"/>
-    <w:lsdException w:name="Table Grid 3" w:semiHidden="1" w:unhideWhenUsed="1"/>
-    <w:lsdException w:name="Table Grid 4" w:semiHidden="1" w:unhideWhenUsed="1"/>
-    <w:lsdException w:name="Table Grid 5" w:semiHidden="1" w:unhideWhenUsed="1"/>
-    <w:lsdException w:name="Table Grid 6" w:semiHidden="1" w:unhideWhenUsed="1"/>
-    <w:lsdException w:name="Table Grid 7" w:semiHidden="1" w:unhideWhenUsed="1"/>
-    <w:lsdException w:name="Table Grid 8" w:semiHidden="1" w:unhideWhenUsed="1"/>
-    <w:lsdException w:name="Table List 1" w:semiHidden="1" w:unhideWhenUsed="1"/>
-    <w:lsdException w:name="Table List 2" w:semiHidden="1" w:unhideWhenUsed="1"/>
-    <w:lsdException w:name="Table List 3" w:semiHidden="1" w:unhideWhenUsed="1"/>
-    <w:lsdException w:name="Table List 4" w:semiHidden="1" w:unhideWhenUsed="1"/>
-    <w:lsdException w:name="Table List 5" w:semiHidden="1" w:unhideWhenUsed="1"/>
-    <w:lsdException w:name="Table List 6" w:semiHidden="1" w:unhideWhenUsed="1"/>
-    <w:lsdException w:name="Table List 7" w:semiHidden="1" w:unhideWhenUsed="1"/>
-    <w:lsdException w:name="Table List 8" w:semiHidden="1" w:unhideWhenUsed="1"/>
-    <w:lsdException w:name="Table 3D effects 1" w:semiHidden="1" w:unhideWhenUsed="1"/>
-    <w:lsdException w:name="Table 3D effects 2" w:semiHidden="1" w:unhideWhenUsed="1"/>
-    <w:lsdException w:name="Table 3D effects 3" w:semiHidden="1" w:unhideWhenUsed="1"/>
-    <w:lsdException w:name="Table Contemporary" w:semiHidden="1" w:unhideWhenUsed="1"/>
-    <w:lsdException w:name="Table Elegant" w:semiHidden="1" w:unhideWhenUsed="1"/>
-    <w:lsdException w:name="Table Professional" w:semiHidden="1" w:unhideWhenUsed="1"/>
-    <w:lsdException w:name="Table Subtle 1" w:semiHidden="1" w:unhideWhenUsed="1"/>
-    <w:lsdException w:name="Table Subtle 2" w:semiHidden="1" w:unhideWhenUsed="1"/>
-    <w:lsdException w:name="Table Web 1" w:semiHidden="1" w:unhideWhenUsed="1"/>
-    <w:lsdException w:name="Table Web 2" w:semiHidden="1" w:unhideWhenUsed="1"/>
-    <w:lsdException w:name="Table Web 3" w:semiHidden="1" w:unhideWhenUsed="1"/>
-    <w:lsdException w:name="Balloon Text" w:semiHidden="1" w:unhideWhenUsed="1"/>
-    <w:lsdException w:name="Table Grid" w:uiPriority="39"/>
-    <w:lsdException w:name="Table Theme" w:semiHidden="1" w:unhideWhenUsed="1"/>
-    <w:lsdException w:name="Placeholder Text" w:semiHidden="1"/>
-    <w:lsdException w:name="No Spacing" w:uiPriority="1" w:qFormat="1"/>
-    <w:lsdException w:name="Light Shading" w:uiPriority="60"/>
-    <w:lsdException w:name="Light List" w:uiPriority="61"/>
-    <w:lsdException w:name="Light Grid" w:uiPriority="62"/>
-    <w:lsdException w:name="Medium Shading 1" w:uiPriority="63"/>
-    <w:lsdException w:name="Medium Shading 2" w:uiPriority="64"/>
-    <w:lsdException w:name="Medium List 1" w:uiPriority="65"/>
-    <w:lsdException w:name="Medium List 2" w:uiPriority="66"/>
-    <w:lsdException w:name="Medium Grid 1" w:uiPriority="67"/>
-    <w:lsdException w:name="Medium Grid 2" w:uiPriority="68"/>
-    <w:lsdException w:name="Medium Grid 3" w:uiPriority="69"/>
-    <w:lsdException w:name="Dark List" w:uiPriority="70"/>
-    <w:lsdException w:name="Colorful Shading" w:uiPriority="71"/>
-    <w:lsdException w:name="Colorful List" w:uiPriority="72"/>
-    <w:lsdException w:name="Colorful Grid" w:uiPriority="73"/>
-    <w:lsdException w:name="Light Shading Accent 1" w:uiPriority="60"/>
-    <w:lsdException w:name="Light List Accent 1" w:uiPriority="61"/>
-    <w:lsdException w:name="Light Grid Accent 1" w:uiPriority="62"/>
-    <w:lsdException w:name="Medium Shading 1 Accent 1" w:uiPriority="63"/>
-    <w:lsdException w:name="Medium Shading 2 Accent 1" w:uiPriority="64"/>
-    <w:lsdException w:name="Medium List 1 Accent 1" w:uiPriority="65"/>
-    <w:lsdException w:name="Revision" w:semiHidden="1"/>
-    <w:lsdException w:name="List Paragraph" w:uiPriority="34" w:qFormat="1"/>
-    <w:lsdException w:name="Quote" w:uiPriority="29" w:qFormat="1"/>
-    <w:lsdException w:name="Intense Quote" w:uiPriority="30" w:qFormat="1"/>
-    <w:lsdException w:name="Medium List 2 Accent 1" w:uiPriority="66"/>
-    <w:lsdException w:name="Medium Grid 1 Accent 1" w:uiPriority="67"/>
-    <w:lsdException w:name="Medium Grid 2 Accent 1" w:uiPriority="68"/>
-    <w:lsdException w:name="Medium Grid 3 Accent 1" w:uiPriority="69"/>
-    <w:lsdException w:name="Dark List Accent 1" w:uiPriority="70"/>
-    <w:lsdException w:name="Colorful Shading Accent 1" w:uiPriority="71"/>
-    <w:lsdException w:name="Colorful List Accent 1" w:uiPriority="72"/>
-    <w:lsdException w:name="Colorful Grid Accent 1" w:uiPriority="73"/>
-    <w:lsdException w:name="Light Shading Accent 2" w:uiPriority="60"/>
-    <w:lsdException w:name="Light List Accent 2" w:uiPriority="61"/>
-    <w:lsdException w:name="Light Grid Accent 2" w:uiPriority="62"/>
-    <w:lsdException w:name="Medium Shading 1 Accent 2" w:uiPriority="63"/>
-    <w:lsdException w:name="Medium Shading 2 Accent 2" w:uiPriority="64"/>
-    <w:lsdException w:name="Medium List 1 Accent 2" w:uiPriority="65"/>
-    <w:lsdException w:name="Medium List 2 Accent 2" w:uiPriority="66"/>
-    <w:lsdException w:name="Medium Grid 1 Accent 2" w:uiPriority="67"/>
-    <w:lsdException w:name="Medium Grid 2 Accent 2" w:uiPriority="68"/>
-    <w:lsdException w:name="Medium Grid 3 Accent 2" w:uiPriority="69"/>
-    <w:lsdException w:name="Dark List Accent 2" w:uiPriority="70"/>
-    <w:lsdException w:name="Colorful Shading Accent 2" w:uiPriority="71"/>
-    <w:lsdException w:name="Colorful List Accent 2" w:uiPriority="72"/>
-    <w:lsdException w:name="Colorful Grid Accent 2" w:uiPriority="73"/>
-    <w:lsdException w:name="Light Shading Accent 3" w:uiPriority="60"/>
-    <w:lsdException w:name="Light List Accent 3" w:uiPriority="61"/>
-    <w:lsdException w:name="Light Grid Accent 3" w:uiPriority="62"/>
-    <w:lsdException w:name="Medium Shading 1 Accent 3" w:uiPriority="63"/>
-    <w:lsdException w:name="Medium Shading 2 Accent 3" w:uiPriority="64"/>
-    <w:lsdException w:name="Medium List 1 Accent 3" w:uiPriority="65"/>
-    <w:lsdException w:name="Medium List 2 Accent 3" w:uiPriority="66"/>
-    <w:lsdException w:name="Medium Grid 1 Accent 3" w:uiPriority="67"/>
-    <w:lsdException w:name="Medium Grid 2 Accent 3" w:uiPriority="68"/>
-    <w:lsdException w:name="Medium Grid 3 Accent 3" w:uiPriority="69"/>
-    <w:lsdException w:name="Dark List Accent 3" w:uiPriority="70"/>
-    <w:lsdException w:name="Colorful Shading Accent 3" w:uiPriority="71"/>
-    <w:lsdException w:name="Colorful List Accent 3" w:uiPriority="72"/>
-    <w:lsdException w:name="Colorful Grid Accent 3" w:uiPriority="73"/>
-    <w:lsdException w:name="Light Shading Accent 4" w:uiPriority="60"/>
-    <w:lsdException w:name="Light List Accent 4" w:uiPriority="61"/>
-    <w:lsdException w:name="Light Grid Accent 4" w:uiPriority="62"/>
-    <w:lsdException w:name="Medium Shading 1 Accent 4" w:uiPriority="63"/>
-    <w:lsdException w:name="Medium Shading 2 Accent 4" w:uiPriority="64"/>
-    <w:lsdException w:name="Medium List 1 Accent 4" w:uiPriority="65"/>
-    <w:lsdException w:name="Medium List 2 Accent 4" w:uiPriority="66"/>
-    <w:lsdException w:name="Medium Grid 1 Accent 4" w:uiPriority="67"/>
-    <w:lsdException w:name="Medium Grid 2 Accent 4" w:uiPriority="68"/>
-    <w:lsdException w:name="Medium Grid 3 Accent 4" w:uiPriority="69"/>
-    <w:lsdException w:name="Dark List Accent 4" w:uiPriority="70"/>
-    <w:lsdException w:name="Colorful Shading Accent 4" w:uiPriority="71"/>
-    <w:lsdException w:name="Colorful List Accent 4" w:uiPriority="72"/>
-    <w:lsdException w:name="Colorful Grid Accent 4" w:uiPriority="73"/>
-    <w:lsdException w:name="Light Shading Accent 5" w:uiPriority="60"/>
-    <w:lsdException w:name="Light List Accent 5" w:uiPriority="61"/>
-    <w:lsdException w:name="Light Grid Accent 5" w:uiPriority="62"/>
-    <w:lsdException w:name="Medium Shading 1 Accent 5" w:uiPriority="63"/>
-    <w:lsdException w:name="Medium Shading 2 Accent 5" w:uiPriority="64"/>
-    <w:lsdException w:name="Medium List 1 Accent 5" w:uiPriority="65"/>
-    <w:lsdException w:name="Medium List 2 Accent 5" w:uiPriority="66"/>
-    <w:lsdException w:name="Medium Grid 1 Accent 5" w:uiPriority="67"/>
-    <w:lsdException w:name="Medium Grid 2 Accent 5" w:uiPriority="68"/>
-    <w:lsdException w:name="Medium Grid 3 Accent 5" w:uiPriority="69"/>
-    <w:lsdException w:name="Dark List Accent 5" w:uiPriority="70"/>
-    <w:lsdException w:name="Colorful Shading Accent 5" w:uiPriority="71"/>
-    <w:lsdException w:name="Colorful List Accent 5" w:uiPriority="72"/>
-    <w:lsdException w:name="Colorful Grid Accent 5" w:uiPriority="73"/>
-    <w:lsdException w:name="Light Shading Accent 6" w:uiPriority="60"/>
-    <w:lsdException w:name="Light List Accent 6" w:uiPriority="61"/>
-    <w:lsdException w:name="Light Grid Accent 6" w:uiPriority="62"/>
-    <w:lsdException w:name="Medium Shading 1 Accent 6" w:uiPriority="63"/>
-    <w:lsdException w:name="Medium Shading 2 Accent 6" w:uiPriority="64"/>
-    <w:lsdException w:name="Medium List 1 Accent 6" w:uiPriority="65"/>
-    <w:lsdException w:name="Medium List 2 Accent 6" w:uiPriority="66"/>
-    <w:lsdException w:name="Medium Grid 1 Accent 6" w:uiPriority="67"/>
-    <w:lsdException w:name="Medium Grid 2 Accent 6" w:uiPriority="68"/>
-    <w:lsdException w:name="Medium Grid 3 Accent 6" w:uiPriority="69"/>
-    <w:lsdException w:name="Dark List Accent 6" w:uiPriority="70"/>
-    <w:lsdException w:name="Colorful Shading Accent 6" w:uiPriority="71"/>
-    <w:lsdException w:name="Colorful List Accent 6" w:uiPriority="72"/>
-    <w:lsdException w:name="Colorful Grid Accent 6" w:uiPriority="73"/>
-    <w:lsdException w:name="Subtle Emphasis" w:uiPriority="19" w:qFormat="1"/>
-    <w:lsdException w:name="Intense Emphasis" w:uiPriority="21" w:qFormat="1"/>
-    <w:lsdException w:name="Subtle Reference" w:uiPriority="31" w:qFormat="1"/>
-    <w:lsdException w:name="Intense Reference" w:uiPriority="32" w:qFormat="1"/>
-    <w:lsdException w:name="Book Title" w:uiPriority="33" w:qFormat="1"/>
-    <w:lsdException w:name="Bibliography" w:semiHidden="1" w:uiPriority="37" w:unhideWhenUsed="1"/>
-    <w:lsdException w:name="TOC Heading" w:semiHidden="1" w:uiPriority="39" w:unhideWhenUsed="1" w:qFormat="1"/>
-    <w:lsdException w:name="Plain Table 1" w:uiPriority="41"/>
-    <w:lsdException w:name="Plain Table 2" w:uiPriority="42"/>
-    <w:lsdException w:name="Plain Table 3" w:uiPriority="43"/>
-    <w:lsdException w:name="Plain Table 4" w:uiPriority="44"/>
-    <w:lsdException w:name="Plain Table 5" w:uiPriority="45"/>
-    <w:lsdException w:name="Grid Table Light" w:uiPriority="40"/>
-    <w:lsdException w:name="Grid Table 1 Light" w:uiPriority="46"/>
-    <w:lsdException w:name="Grid Table 2" w:uiPriority="47"/>
-    <w:lsdException w:name="Grid Table 3" w:uiPriority="48"/>
-    <w:lsdException w:name="Grid Table 4" w:uiPriority="49"/>
-    <w:lsdException w:name="Grid Table 5 Dark" w:uiPriority="50"/>
-    <w:lsdException w:name="Grid Table 6 Colorful" w:uiPriority="51"/>
-    <w:lsdException w:name="Grid Table 7 Colorful" w:uiPriority="52"/>
-    <w:lsdException w:name="Grid Table 1 Light Accent 1" w:uiPriority="46"/>
-    <w:lsdException w:name="Grid Table 2 Accent 1" w:uiPriority="47"/>
-    <w:lsdException w:name="Grid Table 3 Accent 1" w:uiPriority="48"/>
-    <w:lsdException w:name="Grid Table 4 Accent 1" w:uiPriority="49"/>
-    <w:lsdException w:name="Grid Table 5 Dark Accent 1" w:uiPriority="50"/>
-    <w:lsdException w:name="Grid Table 6 Colorful Accent 1" w:uiPriority="51"/>
-    <w:lsdException w:name="Grid Table 7 Colorful Accent 1" w:uiPriority="52"/>
-    <w:lsdException w:name="Grid Table 1 Light Accent 2" w:uiPriority="46"/>
-    <w:lsdException w:name="Grid Table 2 Accent 2" w:uiPriority="47"/>
-    <w:lsdException w:name="Grid Table 3 Accent 2" w:uiPriority="48"/>
-    <w:lsdException w:name="Grid Table 4 Accent 2" w:uiPriority="49"/>
-    <w:lsdException w:name="Grid Table 5 Dark Accent 2" w:uiPriority="50"/>
-    <w:lsdException w:name="Grid Table 6 Colorful Accent 2" w:uiPriority="51"/>
-    <w:lsdException w:name="Grid Table 7 Colorful Accent 2" w:uiPriority="52"/>
-    <w:lsdException w:name="Grid Table 1 Light Accent 3" w:uiPriority="46"/>
-    <w:lsdException w:name="Grid Table 2 Accent 3" w:uiPriority="47"/>
-    <w:lsdException w:name="Grid Table 3 Accent 3" w:uiPriority="48"/>
-    <w:lsdException w:name="Grid Table 4 Accent 3" w:uiPriority="49"/>
-    <w:lsdException w:name="Grid Table 5 Dark Accent 3" w:uiPriority="50"/>
-    <w:lsdException w:name="Grid Table 6 Colorful Accent 3" w:uiPriority="51"/>
-    <w:lsdException w:name="Grid Table 7 Colorful Accent 3" w:uiPriority="52"/>
-    <w:lsdException w:name="Grid Table 1 Light Accent 4" w:uiPriority="46"/>
-    <w:lsdException w:name="Grid Table 2 Accent 4" w:uiPriority="47"/>
-    <w:lsdException w:name="Grid Table 3 Accent 4" w:uiPriority="48"/>
-    <w:lsdException w:name="Grid Table 4 Accent 4" w:uiPriority="49"/>
-    <w:lsdException w:name="Grid Table 5 Dark Accent 4" w:uiPriority="50"/>
-    <w:lsdException w:name="Grid Table 6 Colorful Accent 4" w:uiPriority="51"/>
-    <w:lsdException w:name="Grid Table 7 Colorful Accent 4" w:uiPriority="52"/>
-    <w:lsdException w:name="Grid Table 1 Light Accent 5" w:uiPriority="46"/>
-    <w:lsdException w:name="Grid Table 2 Accent 5" w:uiPriority="47"/>
-    <w:lsdException w:name="Grid Table 3 Accent 5" w:uiPriority="48"/>
-    <w:lsdException w:name="Grid Table 4 Accent 5" w:uiPriority="49"/>
-    <w:lsdException w:name="Grid Table 5 Dark Accent 5" w:uiPriority="50"/>
-    <w:lsdException w:name="Grid Table 6 Colorful Accent 5" w:uiPriority="51"/>
-    <w:lsdException w:name="Grid Table 7 Colorful Accent 5" w:uiPriority="52"/>
-    <w:lsdException w:name="Grid Table 1 Light Accent 6" w:uiPriority="46"/>
-    <w:lsdException w:name="Grid Table 2 Accent 6" w:uiPriority="47"/>
-    <w:lsdException w:name="Grid Table 3 Accent 6" w:uiPriority="48"/>
-    <w:lsdException w:name="Grid Table 4 Accent 6" w:uiPriority="49"/>
-    <w:lsdException w:name="Grid Table 5 Dark Accent 6" w:uiPriority="50"/>
-    <w:lsdException w:name="Grid Table 6 Colorful Accent 6" w:uiPriority="51"/>
-    <w:lsdException w:name="Grid Table 7 Colorful Accent 6" w:uiPriority="52"/>
-    <w:lsdException w:name="List Table 1 Light" w:uiPriority="46"/>
-    <w:lsdException w:name="List Table 2" w:uiPriority="47"/>
-    <w:lsdException w:name="List Table 3" w:uiPriority="48"/>
-    <w:lsdException w:name="List Table 4" w:uiPriority="49"/>
-    <w:lsdException w:name="List Table 5 Dark" w:uiPriority="50"/>
-    <w:lsdException w:name="List Table 6 Colorful" w:uiPriority="51"/>
-    <w:lsdException w:name="List Table 7 Colorful" w:uiPriority="52"/>
-    <w:lsdException w:name="List Table 1 Light Accent 1" w:uiPriority="46"/>
-    <w:lsdException w:name="List Table 2 Accent 1" w:uiPriority="47"/>
-    <w:lsdException w:name="List Table 3 Accent 1" w:uiPriority="48"/>
-    <w:lsdException w:name="List Table 4 Accent 1" w:uiPriority="49"/>
-    <w:lsdException w:name="List Table 5 Dark Accent 1" w:uiPriority="50"/>
-    <w:lsdException w:name="List Table 6 Colorful Accent 1" w:uiPriority="51"/>
-    <w:lsdException w:name="List Table 7 Colorful Accent 1" w:uiPriority="52"/>
-    <w:lsdException w:name="List Table 1 Light Accent 2" w:uiPriority="46"/>
-    <w:lsdException w:name="List Table 2 Accent 2" w:uiPriority="47"/>
-    <w:lsdException w:name="List Table 3 Accent 2" w:uiPriority="48"/>
-    <w:lsdException w:name="List Table 4 Accent 2" w:uiPriority="49"/>
-    <w:lsdException w:name="List Table 5 Dark Accent 2" w:uiPriority="50"/>
-    <w:lsdException w:name="List Table 6 Colorful Accent 2" w:uiPriority="51"/>
-    <w:lsdException w:name="List Table 7 Colorful Accent 2" w:uiPriority="52"/>
-    <w:lsdException w:name="List Table 1 Light Accent 3" w:uiPriority="46"/>
-    <w:lsdException w:name="List Table 2 Accent 3" w:uiPriority="47"/>
-    <w:lsdException w:name="List Table 3 Accent 3" w:uiPriority="48"/>
-    <w:lsdException w:name="List Table 4 Accent 3" w:uiPriority="49"/>
-    <w:lsdException w:name="List Table 5 Dark Accent 3" w:uiPriority="50"/>
-    <w:lsdException w:name="List Table 6 Colorful Accent 3" w:uiPriority="51"/>
-    <w:lsdException w:name="List Table 7 Colorful Accent 3" w:uiPriority="52"/>
-    <w:lsdException w:name="List Table 1 Light Accent 4" w:uiPriority="46"/>
-    <w:lsdException w:name="List Table 2 Accent 4" w:uiPriority="47"/>
-    <w:lsdException w:name="List Table 3 Accent 4" w:uiPriority="48"/>
-    <w:lsdException w:name="List Table 4 Accent 4" w:uiPriority="49"/>
-    <w:lsdException w:name="List Table 5 Dark Accent 4" w:uiPriority="50"/>
-    <w:lsdException w:name="List Table 6 Colorful Accent 4" w:uiPriority="51"/>
-    <w:lsdException w:name="List Table 7 Colorful Accent 4" w:uiPriority="52"/>
-    <w:lsdException w:name="List Table 1 Light Accent 5" w:uiPriority="46"/>
-    <w:lsdException w:name="List Table 2 Accent 5" w:uiPriority="47"/>
-    <w:lsdException w:name="List Table 3 Accent 5" w:uiPriority="48"/>
-    <w:lsdException w:name="List Table 4 Accent 5" w:uiPriority="49"/>
-    <w:lsdException w:name="List Table 5 Dark Accent 5" w:uiPriority="50"/>
-    <w:lsdException w:name="List Table 6 Colorful Accent 5" w:uiPriority="51"/>
-    <w:lsdException w:name="List Table 7 Colorful Accent 5" w:uiPriority="52"/>
-    <w:lsdException w:name="List Table 1 Light Accent 6" w:uiPriority="46"/>
-    <w:lsdException w:name="List Table 2 Accent 6" w:uiPriority="47"/>
-    <w:lsdException w:name="List Table 3 Accent 6" w:uiPriority="48"/>
-    <w:lsdException w:name="List Table 4 Accent 6" w:uiPriority="49"/>
-    <w:lsdException w:name="List Table 5 Dark Accent 6" w:uiPriority="50"/>
-    <w:lsdException w:name="List Table 6 Colorful Accent 6" w:uiPriority="51"/>
-    <w:lsdException w:name="List Table 7 Colorful Accent 6" w:uiPriority="52"/>
-    <w:lsdException w:name="Mention" w:semiHidden="1" w:unhideWhenUsed="1"/>
-    <w:lsdException w:name="Smart Hyperlink" w:semiHidden="1" w:unhideWhenUsed="1"/>
-    <w:lsdException w:name="Hashtag" w:semiHidden="1" w:unhideWhenUsed="1"/>
-    <w:lsdException w:name="Unresolved Mention" w:semiHidden="1" w:unhideWhenUsed="1"/>
-    <w:lsdException w:name="Smart Link" w:semiHidden="1" w:unhideWhenUsed="1"/>
-  </w:latentStyles>
-  <w:style w:type="paragraph" w:default="1" w:styleId="Normal">
-    <w:name w:val="Normal"/>
-    <w:qFormat/>
-  </w:style>
-  <w:style w:type="character" w:default="1" w:styleId="DefaultParagraphFont">
-    <w:name w:val="Default Paragraph Font"/>
-    <w:uiPriority w:val="1"/>
-    <w:semiHidden/>
-    <w:unhideWhenUsed/>
-  </w:style>
-  <w:style w:type="table" w:default="1" w:styleId="TableNormal">
-    <w:name w:val="Normal Table"/>
-    <w:uiPriority w:val="99"/>
-    <w:semiHidden/>
-    <w:unhideWhenUsed/>
-    <w:tblPr>
-      <w:tblInd w:w="0" w:type="dxa"/>
-      <w:tblCellMar>
-        <w:top w:w="0" w:type="dxa"/>
-        <w:left w:w="108" w:type="dxa"/>
-        <w:bottom w:w="0" w:type="dxa"/>
-        <w:right w:w="108" w:type="dxa"/>
-      </w:tblCellMar>
-    </w:tblPr>
-  </w:style>
-  <w:style w:type="numbering" w:default="1" w:styleId="NoList">
-    <w:name w:val="No List"/>
-    <w:uiPriority w:val="99"/>
-    <w:semiHidden/>
-    <w:unhideWhenUsed/>
-  </w:style>
-  <w:style w:type="character" w:styleId="PlaceholderText">
-    <w:name w:val="Placeholder Text"/>
-    <w:basedOn w:val="DefaultParagraphFont"/>
-    <w:uiPriority w:val="99"/>
-    <w:semiHidden/>
-    <w:rsid w:val="009D310D"/>
-    <w:rPr>
-      <w:color w:val="666666"/>
-    </w:rPr>
-  </w:style>
-</w:styles>
-</file>
-
-<file path=word/glossary/webSettings.xml><?xml version="1.0" encoding="utf-8"?>
-<w:webSettings xmlns:mc="http://schemas.openxmlformats.org/markup-compatibility/2006" xmlns:r="http://schemas.openxmlformats.org/officeDocument/2006/relationships" xmlns:w="http://schemas.openxmlformats.org/wordprocessingml/2006/main" xmlns:w14="http://schemas.microsoft.com/office/word/2010/wordml" xmlns:w15="http://schemas.microsoft.com/office/word/2012/wordml" xmlns:w16cex="http://schemas.microsoft.com/office/word/2018/wordml/cex" xmlns:w16cid="http://schemas.microsoft.com/office/word/2016/wordml/cid" xmlns:w16="http://schemas.microsoft.com/office/word/2018/wordml" xmlns:w16sdtdh="http://schemas.microsoft.com/office/word/2020/wordml/sdtdatahash" xmlns:w16se="http://schemas.microsoft.com/office/word/2015/wordml/symex" mc:Ignorable="w14 w15 w16se w16cid w16 w16cex w16sdtdh">
-  <w:optimizeForBrowser/>
-  <w:allowPNG/>
-</w:webSettings>
-</file>
-
 <file path=word/theme/theme1.xml><?xml version="1.0" encoding="utf-8"?>
 <a:theme xmlns:a="http://schemas.openxmlformats.org/drawingml/2006/main" name="Office Theme">
   <a:themeElements>
@@ -2219,18 +1583,15 @@
 </file>
 
 <file path=customXml/item1.xml><?xml version="1.0" encoding="utf-8"?>
-<p:properties xmlns:p="http://schemas.microsoft.com/office/2006/metadata/properties" xmlns:xsi="http://www.w3.org/2001/XMLSchema-instance" xmlns:pc="http://schemas.microsoft.com/office/infopath/2007/PartnerControls">
-  <documentManagement>
-    <_activity xmlns="859145eb-832a-4de4-9da8-7362dd71f5ff" xsi:nil="true"/>
-  </documentManagement>
-</p:properties>
+<?mso-contentType ?>
+<FormTemplates xmlns="http://schemas.microsoft.com/sharepoint/v3/contenttype/forms">
+  <Display>DocumentLibraryForm</Display>
+  <Edit>DocumentLibraryForm</Edit>
+  <New>DocumentLibraryForm</New>
+</FormTemplates>
 </file>
 
 <file path=customXml/item2.xml><?xml version="1.0" encoding="utf-8"?>
-<b:Sources xmlns:b="http://schemas.openxmlformats.org/officeDocument/2006/bibliography" xmlns="http://schemas.openxmlformats.org/officeDocument/2006/bibliography" SelectedStyle="\APASixthEditionOfficeOnline.xsl" StyleName="APA" Version="6"/>
-</file>
-
-<file path=customXml/item3.xml><?xml version="1.0" encoding="utf-8"?>
 <ct:contentTypeSchema xmlns:ct="http://schemas.microsoft.com/office/2006/metadata/contentType" xmlns:ma="http://schemas.microsoft.com/office/2006/metadata/properties/metaAttributes" ct:_="" ma:_="" ma:contentTypeName="Document" ma:contentTypeID="0x010100BA75C95E03F147448007E49A964FB4B7" ma:contentTypeVersion="13" ma:contentTypeDescription="Create a new document." ma:contentTypeScope="" ma:versionID="8c79649f7c77bca428280b829a6e2daf">
   <xsd:schema xmlns:xsd="http://www.w3.org/2001/XMLSchema" xmlns:xs="http://www.w3.org/2001/XMLSchema" xmlns:p="http://schemas.microsoft.com/office/2006/metadata/properties" xmlns:ns3="859145eb-832a-4de4-9da8-7362dd71f5ff" xmlns:ns4="89f6cb76-ad16-4a4b-927f-18b243a8f657" targetNamespace="http://schemas.microsoft.com/office/2006/metadata/properties" ma:root="true" ma:fieldsID="27e8ad6f491bbc7e9223105ff767db64" ns3:_="" ns4:_="">
     <xsd:import namespace="859145eb-832a-4de4-9da8-7362dd71f5ff"/>
@@ -2449,34 +1810,27 @@
 </ct:contentTypeSchema>
 </file>
 
+<file path=customXml/item3.xml><?xml version="1.0" encoding="utf-8"?>
+<b:Sources xmlns:b="http://schemas.openxmlformats.org/officeDocument/2006/bibliography" xmlns="http://schemas.openxmlformats.org/officeDocument/2006/bibliography" SelectedStyle="\APASixthEditionOfficeOnline.xsl" StyleName="APA" Version="6"/>
+</file>
+
 <file path=customXml/item4.xml><?xml version="1.0" encoding="utf-8"?>
-<?mso-contentType ?>
-<FormTemplates xmlns="http://schemas.microsoft.com/sharepoint/v3/contenttype/forms">
-  <Display>DocumentLibraryForm</Display>
-  <Edit>DocumentLibraryForm</Edit>
-  <New>DocumentLibraryForm</New>
-</FormTemplates>
+<p:properties xmlns:p="http://schemas.microsoft.com/office/2006/metadata/properties" xmlns:xsi="http://www.w3.org/2001/XMLSchema-instance" xmlns:pc="http://schemas.microsoft.com/office/infopath/2007/PartnerControls">
+  <documentManagement>
+    <_activity xmlns="859145eb-832a-4de4-9da8-7362dd71f5ff" xsi:nil="true"/>
+  </documentManagement>
+</p:properties>
 </file>
 
 <file path=customXml/itemProps1.xml><?xml version="1.0" encoding="utf-8"?>
-<ds:datastoreItem xmlns:ds="http://schemas.openxmlformats.org/officeDocument/2006/customXml" ds:itemID="{ACE7559C-7401-4199-9E88-8DB1EACBC385}">
+<ds:datastoreItem xmlns:ds="http://schemas.openxmlformats.org/officeDocument/2006/customXml" ds:itemID="{BD32246B-327E-4409-96ED-E6B6FDDDAB38}">
   <ds:schemaRefs>
-    <ds:schemaRef ds:uri="http://schemas.microsoft.com/office/2006/metadata/properties"/>
-    <ds:schemaRef ds:uri="http://schemas.microsoft.com/office/infopath/2007/PartnerControls"/>
-    <ds:schemaRef ds:uri="859145eb-832a-4de4-9da8-7362dd71f5ff"/>
+    <ds:schemaRef ds:uri="http://schemas.microsoft.com/sharepoint/v3/contenttype/forms"/>
   </ds:schemaRefs>
 </ds:datastoreItem>
 </file>
 
 <file path=customXml/itemProps2.xml><?xml version="1.0" encoding="utf-8"?>
-<ds:datastoreItem xmlns:ds="http://schemas.openxmlformats.org/officeDocument/2006/customXml" ds:itemID="{DFCE6319-9443-4EF4-B017-0067C476C0BA}">
-  <ds:schemaRefs>
-    <ds:schemaRef ds:uri="http://schemas.openxmlformats.org/officeDocument/2006/bibliography"/>
-  </ds:schemaRefs>
-</ds:datastoreItem>
-</file>
-
-<file path=customXml/itemProps3.xml><?xml version="1.0" encoding="utf-8"?>
 <ds:datastoreItem xmlns:ds="http://schemas.openxmlformats.org/officeDocument/2006/customXml" ds:itemID="{1561A87B-2F5C-4D08-B832-C99307FF57EC}">
   <ds:schemaRefs>
     <ds:schemaRef ds:uri="http://schemas.microsoft.com/office/2006/metadata/contentType"/>
@@ -2495,10 +1849,20 @@
 </ds:datastoreItem>
 </file>
 
+<file path=customXml/itemProps3.xml><?xml version="1.0" encoding="utf-8"?>
+<ds:datastoreItem xmlns:ds="http://schemas.openxmlformats.org/officeDocument/2006/customXml" ds:itemID="{DFCE6319-9443-4EF4-B017-0067C476C0BA}">
+  <ds:schemaRefs>
+    <ds:schemaRef ds:uri="http://schemas.openxmlformats.org/officeDocument/2006/bibliography"/>
+  </ds:schemaRefs>
+</ds:datastoreItem>
+</file>
+
 <file path=customXml/itemProps4.xml><?xml version="1.0" encoding="utf-8"?>
-<ds:datastoreItem xmlns:ds="http://schemas.openxmlformats.org/officeDocument/2006/customXml" ds:itemID="{BD32246B-327E-4409-96ED-E6B6FDDDAB38}">
+<ds:datastoreItem xmlns:ds="http://schemas.openxmlformats.org/officeDocument/2006/customXml" ds:itemID="{ACE7559C-7401-4199-9E88-8DB1EACBC385}">
   <ds:schemaRefs>
-    <ds:schemaRef ds:uri="http://schemas.microsoft.com/sharepoint/v3/contenttype/forms"/>
+    <ds:schemaRef ds:uri="http://schemas.microsoft.com/office/2006/metadata/properties"/>
+    <ds:schemaRef ds:uri="http://schemas.microsoft.com/office/infopath/2007/PartnerControls"/>
+    <ds:schemaRef ds:uri="859145eb-832a-4de4-9da8-7362dd71f5ff"/>
   </ds:schemaRefs>
 </ds:datastoreItem>
 </file>
</xml_diff>

<commit_message>
Copilot CLI session c0f2b435-59c0-4d51-99c3-1b13aed1c38b changes
</commit_message>
<xml_diff>
--- a/templates/certificate-template.docx
+++ b/templates/certificate-template.docx
@@ -6,6 +6,144 @@
       <w:pPr>
         <w:ind w:left="3024"/>
       </w:pPr>
+      <w:r>
+        <w:rPr>
+          <w:noProof/>
+        </w:rPr>
+        <mc:AlternateContent>
+          <mc:Choice Requires="wps">
+            <w:drawing>
+              <wp:anchor distT="45720" distB="45720" distL="114300" distR="114300" simplePos="0" relativeHeight="251658240" behindDoc="0" locked="0" layoutInCell="1" allowOverlap="1" wp14:anchorId="2AE98E30" wp14:editId="632CCD9B">
+                <wp:simplePos x="0" y="0"/>
+                <wp:positionH relativeFrom="margin">
+                  <wp:posOffset>2282046</wp:posOffset>
+                </wp:positionH>
+                <wp:positionV relativeFrom="paragraph">
+                  <wp:posOffset>2530456</wp:posOffset>
+                </wp:positionV>
+                <wp:extent cx="6664325" cy="861060"/>
+                <wp:effectExtent l="0" t="0" r="0" b="0"/>
+                <wp:wrapSquare wrapText="bothSides"/>
+                <wp:docPr id="217" name="Text Box 2"/>
+                <wp:cNvGraphicFramePr>
+                  <a:graphicFrameLocks xmlns:a="http://schemas.openxmlformats.org/drawingml/2006/main"/>
+                </wp:cNvGraphicFramePr>
+                <a:graphic xmlns:a="http://schemas.openxmlformats.org/drawingml/2006/main">
+                  <a:graphicData uri="http://schemas.microsoft.com/office/word/2010/wordprocessingShape">
+                    <wps:wsp>
+                      <wps:cNvSpPr txBox="1">
+                        <a:spLocks noChangeArrowheads="1"/>
+                      </wps:cNvSpPr>
+                      <wps:spPr bwMode="auto">
+                        <a:xfrm>
+                          <a:off x="0" y="0"/>
+                          <a:ext cx="6664325" cy="861060"/>
+                        </a:xfrm>
+                        <a:prstGeom prst="rect">
+                          <a:avLst/>
+                        </a:prstGeom>
+                        <a:noFill/>
+                        <a:ln w="9525">
+                          <a:noFill/>
+                          <a:miter lim="800000"/>
+                          <a:headEnd/>
+                          <a:tailEnd/>
+                        </a:ln>
+                      </wps:spPr>
+                      <wps:txbx>
+                        <w:txbxContent>
+                          <w:p>
+                            <w:pPr>
+                              <w:rPr>
+                                <w:rFonts w:ascii="Segoe Pro" w:hAnsi="Segoe Pro"/>
+                                <w:sz w:val="80"/>
+                                <w:szCs w:val="80"/>
+                              </w:rPr>
+                            </w:pPr>
+                            <w:sdt>
+                              <w:sdtPr>
+                                <w:rPr>
+                                  <w:sz w:val="84"/>
+                                  <w:szCs w:val="84"/>
+                                </w:rPr>
+                                <w:id w:val="-164330075"/>
+                                <w:text/>
+                              </w:sdtPr>
+                              <w:sdtEndPr/>
+                              <w:sdtContent>
+                                <w:r>
+                                  <w:rPr>
+                                    <w:sz w:val="84"/>
+                                    <w:szCs w:val="84"/>
+                                  </w:rPr>
+                                  <w:t>{{name}}</w:t>
+                                </w:r>
+                              </w:sdtContent>
+                            </w:sdt>
+                          </w:p>
+                        </w:txbxContent>
+                      </wps:txbx>
+                      <wps:bodyPr rot="0" vert="horz" wrap="square" lIns="91440" tIns="45720" rIns="91440" bIns="45720" anchor="t" anchorCtr="0">
+                        <a:noAutofit/>
+                      </wps:bodyPr>
+                    </wps:wsp>
+                  </a:graphicData>
+                </a:graphic>
+                <wp14:sizeRelH relativeFrom="margin">
+                  <wp14:pctWidth>0</wp14:pctWidth>
+                </wp14:sizeRelH>
+                <wp14:sizeRelV relativeFrom="margin">
+                  <wp14:pctHeight>0</wp14:pctHeight>
+                </wp14:sizeRelV>
+              </wp:anchor>
+            </w:drawing>
+          </mc:Choice>
+          <mc:Fallback>
+            <w:pict>
+              <v:shapetype w14:anchorId="2AE98E30" id="_x0000_t202" coordsize="21600,21600" o:spt="202" path="m,l,21600r21600,l21600,xe">
+                <v:stroke joinstyle="miter"/>
+                <v:path gradientshapeok="t" o:connecttype="rect"/>
+              </v:shapetype>
+              <v:shape id="Text Box 2" o:spid="_x0000_s1026" type="#_x0000_t202" style="position:absolute;left:0;text-align:left;margin-left:179.7pt;margin-top:199.25pt;width:524.75pt;height:67.8pt;z-index:251658240;visibility:visible;mso-wrap-style:square;mso-width-percent:0;mso-height-percent:0;mso-wrap-distance-left:9pt;mso-wrap-distance-top:3.6pt;mso-wrap-distance-right:9pt;mso-wrap-distance-bottom:3.6pt;mso-position-horizontal:absolute;mso-position-horizontal-relative:margin;mso-position-vertical:absolute;mso-position-vertical-relative:text;mso-width-percent:0;mso-height-percent:0;mso-width-relative:margin;mso-height-relative:margin;v-text-anchor:top" o:gfxdata="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" filled="f" stroked="f">
+                <v:textbox>
+                  <w:txbxContent>
+                    <w:p>
+                      <w:pPr>
+                        <w:rPr>
+                          <w:rFonts w:ascii="Segoe Pro" w:hAnsi="Segoe Pro"/>
+                          <w:sz w:val="80"/>
+                          <w:szCs w:val="80"/>
+                        </w:rPr>
+                      </w:pPr>
+                      <w:sdt>
+                        <w:sdtPr>
+                          <w:rPr>
+                            <w:sz w:val="84"/>
+                            <w:szCs w:val="84"/>
+                          </w:rPr>
+                          <w:id w:val="-164330075"/>
+                          <w:text/>
+                        </w:sdtPr>
+                        <w:sdtEndPr/>
+                        <w:sdtContent>
+                          <w:r>
+                            <w:rPr>
+                              <w:sz w:val="84"/>
+                              <w:szCs w:val="84"/>
+                            </w:rPr>
+                            <w:t>{{name}}</w:t>
+                          </w:r>
+                        </w:sdtContent>
+                      </w:sdt>
+                    </w:p>
+                  </w:txbxContent>
+                </v:textbox>
+                <w10:wrap type="square" anchorx="margin"/>
+              </v:shape>
+            </w:pict>
+          </mc:Fallback>
+        </mc:AlternateContent>
+      </w:r>
       <w:r>
         <w:rPr>
           <w:noProof/>
@@ -69,6 +207,7 @@
                                 <w:id w:val="573324187"/>
                                 <w:text/>
                               </w:sdtPr>
+                              <w:sdtEndPr/>
                               <w:sdtContent>
                                 <w:r>
                                   <w:rPr>
@@ -147,7 +286,7 @@
           <w:noProof/>
         </w:rPr>
         <w:drawing>
-          <wp:anchor distT="0" distB="0" distL="114300" distR="114300" simplePos="0" relativeHeight="251662336" behindDoc="1" locked="0" layoutInCell="1" allowOverlap="1" wp14:anchorId="3DF5C24E" wp14:editId="5665ECCE">
+          <wp:anchor distT="0" distB="0" distL="114300" distR="114300" simplePos="0" relativeHeight="251662336" behindDoc="1" locked="0" layoutInCell="1" allowOverlap="1" wp14:anchorId="3DF5C24E" wp14:editId="10735BFC">
             <wp:simplePos x="0" y="0"/>
             <wp:positionH relativeFrom="page">
               <wp:align>left</wp:align>
@@ -204,144 +343,6 @@
             </wp14:sizeRelV>
           </wp:anchor>
         </w:drawing>
-      </w:r>
-      <w:r>
-        <w:rPr>
-          <w:noProof/>
-        </w:rPr>
-        <mc:AlternateContent>
-          <mc:Choice Requires="wps">
-            <w:drawing>
-              <wp:anchor distT="45720" distB="45720" distL="114300" distR="114300" simplePos="0" relativeHeight="251658240" behindDoc="0" locked="0" layoutInCell="1" allowOverlap="1" wp14:anchorId="2AE98E30" wp14:editId="6DE9CC1A">
-                <wp:simplePos x="0" y="0"/>
-                <wp:positionH relativeFrom="margin">
-                  <wp:posOffset>1350320</wp:posOffset>
-                </wp:positionH>
-                <wp:positionV relativeFrom="paragraph">
-                  <wp:posOffset>2540635</wp:posOffset>
-                </wp:positionV>
-                <wp:extent cx="6664325" cy="861060"/>
-                <wp:effectExtent l="0" t="0" r="0" b="0"/>
-                <wp:wrapSquare wrapText="bothSides"/>
-                <wp:docPr id="217" name="Text Box 2"/>
-                <wp:cNvGraphicFramePr>
-                  <a:graphicFrameLocks xmlns:a="http://schemas.openxmlformats.org/drawingml/2006/main"/>
-                </wp:cNvGraphicFramePr>
-                <a:graphic xmlns:a="http://schemas.openxmlformats.org/drawingml/2006/main">
-                  <a:graphicData uri="http://schemas.microsoft.com/office/word/2010/wordprocessingShape">
-                    <wps:wsp>
-                      <wps:cNvSpPr txBox="1">
-                        <a:spLocks noChangeArrowheads="1"/>
-                      </wps:cNvSpPr>
-                      <wps:spPr bwMode="auto">
-                        <a:xfrm>
-                          <a:off x="0" y="0"/>
-                          <a:ext cx="6664325" cy="861060"/>
-                        </a:xfrm>
-                        <a:prstGeom prst="rect">
-                          <a:avLst/>
-                        </a:prstGeom>
-                        <a:noFill/>
-                        <a:ln w="9525">
-                          <a:noFill/>
-                          <a:miter lim="800000"/>
-                          <a:headEnd/>
-                          <a:tailEnd/>
-                        </a:ln>
-                      </wps:spPr>
-                      <wps:txbx>
-                        <w:txbxContent>
-                          <w:p>
-                            <w:pPr>
-                              <w:rPr>
-                                <w:rFonts w:ascii="Segoe Pro" w:hAnsi="Segoe Pro"/>
-                                <w:sz w:val="80"/>
-                                <w:szCs w:val="80"/>
-                              </w:rPr>
-                            </w:pPr>
-                            <w:sdt>
-                              <w:sdtPr>
-                                <w:rPr>
-                                  <w:sz w:val="84"/>
-                                  <w:szCs w:val="84"/>
-                                </w:rPr>
-                                <w:id w:val="-164330075"/>
-                                <w:placeholder>
-                                  <w:docPart w:val="DefaultPlaceholder_-1854013440"/>
-                                </w:placeholder>
-                                <w:text/>
-                              </w:sdtPr>
-                              <w:sdtContent>
-                                <w:r>
-                                  <w:rPr>
-                                    <w:sz w:val="84"/>
-                                    <w:szCs w:val="84"/>
-                                  </w:rPr>
-                                  <w:t>{{name}}</w:t>
-                                </w:r>
-                              </w:sdtContent>
-                            </w:sdt>
-                          </w:p>
-                        </w:txbxContent>
-                      </wps:txbx>
-                      <wps:bodyPr rot="0" vert="horz" wrap="square" lIns="91440" tIns="45720" rIns="91440" bIns="45720" anchor="t" anchorCtr="0">
-                        <a:noAutofit/>
-                      </wps:bodyPr>
-                    </wps:wsp>
-                  </a:graphicData>
-                </a:graphic>
-                <wp14:sizeRelH relativeFrom="margin">
-                  <wp14:pctWidth>0</wp14:pctWidth>
-                </wp14:sizeRelH>
-                <wp14:sizeRelV relativeFrom="margin">
-                  <wp14:pctHeight>0</wp14:pctHeight>
-                </wp14:sizeRelV>
-              </wp:anchor>
-            </w:drawing>
-          </mc:Choice>
-          <mc:Fallback>
-            <w:pict>
-              <v:shape w14:anchorId="2AE98E30" id="_x0000_s1027" type="#_x0000_t202" style="position:absolute;left:0;text-align:left;margin-left:106.3pt;margin-top:200.05pt;width:524.75pt;height:67.8pt;z-index:251658240;visibility:visible;mso-wrap-style:square;mso-width-percent:0;mso-height-percent:0;mso-wrap-distance-left:9pt;mso-wrap-distance-top:3.6pt;mso-wrap-distance-right:9pt;mso-wrap-distance-bottom:3.6pt;mso-position-horizontal:absolute;mso-position-horizontal-relative:margin;mso-position-vertical:absolute;mso-position-vertical-relative:text;mso-width-percent:0;mso-height-percent:0;mso-width-relative:margin;mso-height-relative:margin;v-text-anchor:top" o:gfxdata="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" filled="f" stroked="f">
-                <v:textbox>
-                  <w:txbxContent>
-                    <w:p>
-                      <w:pPr>
-                        <w:rPr>
-                          <w:rFonts w:ascii="Segoe Pro" w:hAnsi="Segoe Pro"/>
-                          <w:sz w:val="80"/>
-                          <w:szCs w:val="80"/>
-                        </w:rPr>
-                      </w:pPr>
-                      <w:sdt>
-                        <w:sdtPr>
-                          <w:rPr>
-                            <w:sz w:val="84"/>
-                            <w:szCs w:val="84"/>
-                          </w:rPr>
-                          <w:id w:val="-164330075"/>
-                          <w:placeholder>
-                            <w:docPart w:val="DefaultPlaceholder_-1854013440"/>
-                          </w:placeholder>
-                          <w:text/>
-                        </w:sdtPr>
-                        <w:sdtContent>
-                          <w:r>
-                            <w:rPr>
-                              <w:sz w:val="84"/>
-                              <w:szCs w:val="84"/>
-                            </w:rPr>
-                            <w:t>{{name}}</w:t>
-                          </w:r>
-                        </w:sdtContent>
-                      </w:sdt>
-                    </w:p>
-                  </w:txbxContent>
-                </v:textbox>
-                <w10:wrap type="square" anchorx="margin"/>
-              </v:shape>
-            </w:pict>
-          </mc:Fallback>
-        </mc:AlternateContent>
       </w:r>
     </w:p>
     <w:sectPr>

</xml_diff>